<commit_message>
Report: revise task 2
</commit_message>
<xml_diff>
--- a/Report/Task 02.docx
+++ b/Report/Task 02.docx
@@ -38,6 +38,7 @@
           <w:ilvl w:val="0"/>
           <w:numId w:val="86"/>
         </w:numPr>
+        <w:jc w:val="both"/>
       </w:pPr>
       <w:r>
         <w:t>A chess knight moves in an “L” shape: two squares in one direction and then one square perpendicular.</w:t>
@@ -50,6 +51,7 @@
           <w:ilvl w:val="0"/>
           <w:numId w:val="86"/>
         </w:numPr>
+        <w:jc w:val="both"/>
       </w:pPr>
       <w:r>
         <w:t>On an </w:t>
@@ -89,6 +91,7 @@
           <w:ilvl w:val="0"/>
           <w:numId w:val="86"/>
         </w:numPr>
+        <w:jc w:val="both"/>
         <w:rPr>
           <w:b/>
           <w:bCs/>
@@ -154,6 +157,7 @@
           <w:ilvl w:val="0"/>
           <w:numId w:val="86"/>
         </w:numPr>
+        <w:jc w:val="both"/>
       </w:pPr>
       <w:r>
         <w:t>In the context of a closed (re</w:t>
@@ -180,6 +184,7 @@
           <w:ilvl w:val="0"/>
           <w:numId w:val="86"/>
         </w:numPr>
+        <w:jc w:val="both"/>
       </w:pPr>
       <w:r>
         <w:t>Warnsdorff’s rule is a </w:t>
@@ -221,6 +226,7 @@
           <w:ilvl w:val="0"/>
           <w:numId w:val="86"/>
         </w:numPr>
+        <w:jc w:val="both"/>
       </w:pPr>
       <w:r>
         <w:t>In </w:t>
@@ -277,13 +283,21 @@
           <w:ilvl w:val="0"/>
           <w:numId w:val="86"/>
         </w:numPr>
+        <w:jc w:val="both"/>
       </w:pPr>
       <w:r>
         <w:rPr>
           <w:b/>
           <w:bCs/>
         </w:rPr>
-        <w:t>greedy algorithm</w:t>
+        <w:t>G</w:t>
+      </w:r>
+      <w:r>
+        <w:rPr>
+          <w:b/>
+          <w:bCs/>
+        </w:rPr>
+        <w:t>reedy algorithm</w:t>
       </w:r>
       <w:r>
         <w:t> is a problem</w:t>
@@ -302,11 +316,15 @@
       <w:r>
         <w:t> at each step, hoping that these local optima will lead to a global optimum solution</w:t>
       </w:r>
+      <w:r>
+        <w:t>.</w:t>
+      </w:r>
     </w:p>
     <w:p>
       <w:pPr>
         <w:pStyle w:val="Heading2"/>
         <w:spacing w:before="0"/>
+        <w:jc w:val="both"/>
       </w:pPr>
       <w:bookmarkStart w:id="2" w:name="_Toc217532938"/>
       <w:bookmarkStart w:id="3" w:name="_Toc217598122"/>
@@ -335,6 +353,7 @@
           <w:tab w:val="num" w:pos="1440"/>
         </w:tabs>
         <w:ind w:left="1440"/>
+        <w:jc w:val="both"/>
         <w:rPr>
           <w:lang w:bidi="ar-EG"/>
         </w:rPr>
@@ -349,16 +368,28 @@
       </w:r>
       <w:r>
         <w:rPr>
-          <w:lang w:bidi="ar-EG"/>
-        </w:rPr>
-        <w:br/>
+          <w:b/>
+          <w:bCs/>
+          <w:lang w:bidi="ar-EG"/>
+        </w:rPr>
+        <w:t xml:space="preserve">: </w:t>
+      </w:r>
+      <w:r>
+        <w:rPr>
+          <w:lang w:bidi="ar-EG"/>
+        </w:rPr>
         <w:t>Is it possible for a knight to visit all 64 squares of a standard chessboard exactly once, ending on a square that is one knight’s move away from the starting square?</w:t>
       </w:r>
       <w:r>
         <w:rPr>
           <w:lang w:bidi="ar-EG"/>
         </w:rPr>
-        <w:br/>
+        <w:t xml:space="preserve"> </w:t>
+      </w:r>
+      <w:r>
+        <w:rPr>
+          <w:lang w:bidi="ar-EG"/>
+        </w:rPr>
         <w:t>Justify your answer.</w:t>
       </w:r>
     </w:p>
@@ -373,19 +404,11 @@
           <w:tab w:val="num" w:pos="1440"/>
         </w:tabs>
         <w:ind w:left="1440"/>
-        <w:rPr>
-          <w:lang w:bidi="ar-EG"/>
-        </w:rPr>
-      </w:pPr>
-      <w:r>
-        <w:rPr>
-          <w:rFonts w:ascii="Segoe UI" w:hAnsi="Segoe UI" w:cs="Segoe UI"/>
-          <w:b/>
-          <w:bCs/>
-          <w:color w:val="F9FAFB"/>
-        </w:rPr>
-        <w:t xml:space="preserve"> </w:t>
-      </w:r>
+        <w:jc w:val="both"/>
+        <w:rPr>
+          <w:lang w:bidi="ar-EG"/>
+        </w:rPr>
+      </w:pPr>
       <w:r>
         <w:rPr>
           <w:b/>
@@ -411,14 +434,22 @@
         </w:rPr>
         <w:t> board</w:t>
       </w:r>
-    </w:p>
-    <w:p>
-      <w:pPr>
-        <w:ind w:left="1440"/>
-        <w:rPr>
-          <w:lang w:bidi="ar-EG"/>
-        </w:rPr>
-      </w:pPr>
+      <w:r>
+        <w:rPr>
+          <w:b/>
+          <w:bCs/>
+          <w:lang w:bidi="ar-EG"/>
+        </w:rPr>
+        <w:t>:</w:t>
+      </w:r>
+      <w:r>
+        <w:rPr>
+          <w:b/>
+          <w:bCs/>
+          <w:lang w:bidi="ar-EG"/>
+        </w:rPr>
+        <w:t xml:space="preserve"> </w:t>
+      </w:r>
       <w:r>
         <w:rPr>
           <w:lang w:bidi="ar-EG"/>
@@ -444,6 +475,7 @@
     <w:p>
       <w:pPr>
         <w:ind w:left="1440"/>
+        <w:jc w:val="both"/>
         <w:rPr>
           <w:lang w:bidi="ar-EG"/>
         </w:rPr>
@@ -482,6 +514,7 @@
           <w:tab w:val="num" w:pos="1440"/>
         </w:tabs>
         <w:ind w:left="1440"/>
+        <w:jc w:val="both"/>
         <w:rPr>
           <w:lang w:bidi="ar-EG"/>
         </w:rPr>
@@ -496,9 +529,16 @@
       </w:r>
       <w:r>
         <w:rPr>
-          <w:lang w:bidi="ar-EG"/>
-        </w:rPr>
-        <w:br/>
+          <w:b/>
+          <w:bCs/>
+          <w:lang w:bidi="ar-EG"/>
+        </w:rPr>
+        <w:t xml:space="preserve">: </w:t>
+      </w:r>
+      <w:r>
+        <w:rPr>
+          <w:lang w:bidi="ar-EG"/>
+        </w:rPr>
         <w:t>Design a </w:t>
       </w:r>
       <w:r>
@@ -580,6 +620,7 @@
       <w:pPr>
         <w:pStyle w:val="Heading2"/>
         <w:spacing w:before="0"/>
+        <w:jc w:val="both"/>
       </w:pPr>
       <w:bookmarkStart w:id="5" w:name="_Toc217532940"/>
       <w:bookmarkStart w:id="6" w:name="_Toc217598124"/>
@@ -607,6 +648,7 @@
           <w:tab w:val="clear" w:pos="1440"/>
           <w:tab w:val="num" w:pos="720"/>
         </w:tabs>
+        <w:jc w:val="both"/>
         <w:rPr>
           <w:lang w:bidi="ar-EG"/>
         </w:rPr>
@@ -627,7 +669,13 @@
         <w:rPr>
           <w:lang w:bidi="ar-EG"/>
         </w:rPr>
-        <w:t xml:space="preserve"> rows or columns of the board </w:t>
+        <w:t xml:space="preserve"> rows or columns of the board</w:t>
+      </w:r>
+      <w:r>
+        <w:rPr>
+          <w:lang w:bidi="ar-EG"/>
+        </w:rPr>
+        <w:t>.</w:t>
       </w:r>
     </w:p>
     <w:p>
@@ -640,6 +688,7 @@
           <w:tab w:val="clear" w:pos="1440"/>
           <w:tab w:val="num" w:pos="720"/>
         </w:tabs>
+        <w:jc w:val="both"/>
         <w:rPr>
           <w:lang w:bidi="ar-EG"/>
         </w:rPr>
@@ -649,6 +698,12 @@
           <w:lang w:bidi="ar-EG"/>
         </w:rPr>
         <w:t>Get the start square from the user</w:t>
+      </w:r>
+      <w:r>
+        <w:rPr>
+          <w:lang w:bidi="ar-EG"/>
+        </w:rPr>
+        <w:t>.</w:t>
       </w:r>
     </w:p>
     <w:p>
@@ -661,27 +716,40 @@
           <w:tab w:val="clear" w:pos="1440"/>
           <w:tab w:val="num" w:pos="720"/>
         </w:tabs>
-        <w:rPr>
-          <w:lang w:bidi="ar-EG"/>
-        </w:rPr>
-      </w:pPr>
-      <w:r>
-        <w:rPr>
-          <w:lang w:bidi="ar-EG"/>
-        </w:rPr>
-        <w:t xml:space="preserve">Run greedy algorithm to find is </w:t>
-      </w:r>
-      <w:r>
-        <w:rPr>
-          <w:lang w:bidi="ar-EG"/>
-        </w:rPr>
-        <w:t xml:space="preserve">there </w:t>
+        <w:jc w:val="both"/>
+        <w:rPr>
+          <w:lang w:bidi="ar-EG"/>
+        </w:rPr>
+      </w:pPr>
+      <w:r>
+        <w:rPr>
+          <w:lang w:bidi="ar-EG"/>
+        </w:rPr>
+        <w:t xml:space="preserve">Run greedy algorithm to find </w:t>
+      </w:r>
+      <w:r>
+        <w:rPr>
+          <w:lang w:bidi="ar-EG"/>
+        </w:rPr>
+        <w:t>whether there is a</w:t>
+      </w:r>
+      <w:r>
+        <w:rPr>
+          <w:lang w:bidi="ar-EG"/>
+        </w:rPr>
+        <w:t xml:space="preserve"> </w:t>
       </w:r>
       <w:r>
         <w:rPr>
           <w:lang w:bidi="ar-EG"/>
         </w:rPr>
         <w:t>closed Tour</w:t>
+      </w:r>
+      <w:r>
+        <w:rPr>
+          <w:lang w:bidi="ar-EG"/>
+        </w:rPr>
+        <w:t>.</w:t>
       </w:r>
     </w:p>
     <w:p>
@@ -694,6 +762,7 @@
           <w:tab w:val="clear" w:pos="1440"/>
           <w:tab w:val="num" w:pos="720"/>
         </w:tabs>
+        <w:jc w:val="both"/>
         <w:rPr>
           <w:lang w:bidi="ar-EG"/>
         </w:rPr>
@@ -719,77 +788,52 @@
     </w:p>
     <w:p>
       <w:pPr>
-        <w:tabs>
-          <w:tab w:val="num" w:pos="720"/>
-        </w:tabs>
-        <w:ind w:left="1440"/>
-        <w:rPr>
-          <w:lang w:bidi="ar-EG"/>
-        </w:rPr>
-      </w:pPr>
+        <w:spacing w:after="160" w:line="259" w:lineRule="auto"/>
+        <w:ind w:left="0"/>
+        <w:rPr>
+          <w:lang w:bidi="ar-EG"/>
+        </w:rPr>
+      </w:pPr>
+      <w:r>
+        <w:rPr>
+          <w:lang w:bidi="ar-EG"/>
+        </w:rPr>
+        <w:br w:type="page"/>
+      </w:r>
     </w:p>
     <w:p>
       <w:pPr>
-        <w:tabs>
-          <w:tab w:val="num" w:pos="720"/>
-        </w:tabs>
-        <w:ind w:left="0"/>
-        <w:rPr>
-          <w:lang w:bidi="ar-EG"/>
-        </w:rPr>
-      </w:pPr>
+        <w:pStyle w:val="Heading2"/>
+        <w:spacing w:before="0"/>
+      </w:pPr>
+      <w:bookmarkStart w:id="8" w:name="_Toc226693034"/>
+      <w:r>
+        <w:lastRenderedPageBreak/>
+        <w:t>Comprehensive Description</w:t>
+      </w:r>
+      <w:bookmarkEnd w:id="8"/>
+      <w:r>
+        <w:t xml:space="preserve"> </w:t>
+      </w:r>
     </w:p>
     <w:p>
       <w:pPr>
-        <w:tabs>
-          <w:tab w:val="num" w:pos="720"/>
-        </w:tabs>
-        <w:ind w:left="1440"/>
-        <w:rPr>
-          <w:lang w:bidi="ar-EG"/>
-        </w:rPr>
-      </w:pPr>
+        <w:ind w:left="0" w:firstLine="360"/>
+        <w:jc w:val="both"/>
+        <w:rPr>
+          <w:lang w:bidi="ar-EG"/>
+        </w:rPr>
+      </w:pPr>
+      <w:r>
+        <w:rPr>
+          <w:lang w:bidi="ar-EG"/>
+        </w:rPr>
+        <w:t>The knight’s tour is a classic mathematical and computational puzzle that asks whether a chess knight can visit every square of a given chessboard exactly once, moving according to the standard rules of chess. A knight moves in an “L” shape: two squares in one direction (horizontally or vertically) and then one square perpendicular, or vice versa. The knight does not jump over pieces, but the board is initially empty; only the knight’s movement restrictions matter.</w:t>
+      </w:r>
     </w:p>
     <w:p>
       <w:pPr>
-        <w:tabs>
-          <w:tab w:val="num" w:pos="720"/>
-        </w:tabs>
-        <w:ind w:left="1440"/>
-        <w:rPr>
-          <w:lang w:bidi="ar-EG"/>
-        </w:rPr>
-      </w:pPr>
-    </w:p>
-    <w:p>
-      <w:pPr>
-        <w:pStyle w:val="Heading2"/>
-        <w:spacing w:before="0"/>
-      </w:pPr>
-      <w:bookmarkStart w:id="8" w:name="_Toc226693034"/>
-      <w:r>
-        <w:t>Comprehensive Description</w:t>
-      </w:r>
-      <w:bookmarkEnd w:id="8"/>
-      <w:r>
-        <w:t xml:space="preserve"> </w:t>
-      </w:r>
-    </w:p>
-    <w:p>
-      <w:pPr>
-        <w:rPr>
-          <w:lang w:bidi="ar-EG"/>
-        </w:rPr>
-      </w:pPr>
-      <w:r>
-        <w:rPr>
-          <w:lang w:bidi="ar-EG"/>
-        </w:rPr>
-        <w:t>The knight’s tour is a classic mathematical and computational puzzle that asks whether a chess knight can visit every square of a given chessboard exactly once, moving according to the standard rules of chess. A knight moves in an “L” shape: two squares in one direction (horizontally or vertically) and then one square perpendicular, or vice versa. The knight does not jump over pieces, but the board is initially empty; only the knight’s movement restrictions matter.</w:t>
-      </w:r>
-    </w:p>
-    <w:p>
-      <w:pPr>
+        <w:jc w:val="both"/>
         <w:rPr>
           <w:lang w:bidi="ar-EG"/>
         </w:rPr>
@@ -811,6 +855,7 @@
           <w:tab w:val="clear" w:pos="1440"/>
           <w:tab w:val="num" w:pos="720"/>
         </w:tabs>
+        <w:jc w:val="both"/>
         <w:rPr>
           <w:lang w:bidi="ar-EG"/>
         </w:rPr>
@@ -840,6 +885,7 @@
           <w:tab w:val="clear" w:pos="1440"/>
           <w:tab w:val="num" w:pos="720"/>
         </w:tabs>
+        <w:jc w:val="both"/>
         <w:rPr>
           <w:lang w:bidi="ar-EG"/>
         </w:rPr>
@@ -871,6 +917,7 @@
     <w:p>
       <w:pPr>
         <w:ind w:firstLine="360"/>
+        <w:jc w:val="both"/>
         <w:rPr>
           <w:color w:val="EE0000"/>
           <w:lang w:bidi="ar-EG"/>
@@ -893,6 +940,7 @@
         <w:tabs>
           <w:tab w:val="num" w:pos="720"/>
         </w:tabs>
+        <w:jc w:val="both"/>
         <w:rPr>
           <w:lang w:bidi="ar-EG"/>
         </w:rPr>
@@ -942,6 +990,7 @@
         <w:tabs>
           <w:tab w:val="num" w:pos="720"/>
         </w:tabs>
+        <w:jc w:val="both"/>
         <w:rPr>
           <w:lang w:bidi="ar-EG"/>
         </w:rPr>
@@ -976,6 +1025,7 @@
         <w:tabs>
           <w:tab w:val="num" w:pos="720"/>
         </w:tabs>
+        <w:jc w:val="both"/>
         <w:rPr>
           <w:lang w:bidi="ar-EG"/>
         </w:rPr>
@@ -1010,6 +1060,7 @@
         <w:tabs>
           <w:tab w:val="num" w:pos="720"/>
         </w:tabs>
+        <w:jc w:val="both"/>
         <w:rPr>
           <w:lang w:bidi="ar-EG"/>
         </w:rPr>
@@ -1059,13 +1110,8 @@
       <w:pPr>
         <w:pStyle w:val="Heading3"/>
       </w:pPr>
-      <w:bookmarkStart w:id="10" w:name="_Toc226693036"/>
-      <w:r>
-        <w:t>Detailed explanation of the solution</w:t>
-      </w:r>
-      <w:bookmarkEnd w:id="10"/>
-      <w:r>
-        <w:t xml:space="preserve"> </w:t>
+      <w:r>
+        <w:t>Methodology</w:t>
       </w:r>
     </w:p>
     <w:p>
@@ -1075,6 +1121,7 @@
           <w:ilvl w:val="0"/>
           <w:numId w:val="91"/>
         </w:numPr>
+        <w:jc w:val="lowKashida"/>
         <w:rPr>
           <w:lang w:bidi="ar-EG"/>
         </w:rPr>
@@ -1097,7 +1144,19 @@
         <w:rPr>
           <w:lang w:bidi="ar-EG"/>
         </w:rPr>
-        <w:t xml:space="preserve"> in the remaining graph). </w:t>
+        <w:t> in the remaining</w:t>
+      </w:r>
+      <w:r>
+        <w:rPr>
+          <w:lang w:bidi="ar-EG"/>
+        </w:rPr>
+        <w:t xml:space="preserve"> </w:t>
+      </w:r>
+      <w:r>
+        <w:rPr>
+          <w:lang w:bidi="ar-EG"/>
+        </w:rPr>
+        <w:t xml:space="preserve">graph). </w:t>
       </w:r>
       <w:r>
         <w:rPr>
@@ -1139,6 +1198,7 @@
           <w:ilvl w:val="0"/>
           <w:numId w:val="91"/>
         </w:numPr>
+        <w:jc w:val="both"/>
         <w:rPr>
           <w:lang w:bidi="ar-EG"/>
         </w:rPr>
@@ -1177,6 +1237,7 @@
     <w:p>
       <w:pPr>
         <w:ind w:left="1440"/>
+        <w:jc w:val="both"/>
         <w:rPr>
           <w:lang w:bidi="ar-EG"/>
         </w:rPr>
@@ -1198,6 +1259,7 @@
     <w:p>
       <w:pPr>
         <w:ind w:left="1440"/>
+        <w:jc w:val="both"/>
         <w:rPr>
           <w:lang w:bidi="ar-EG"/>
         </w:rPr>
@@ -1210,6 +1272,7 @@
           <w:ilvl w:val="0"/>
           <w:numId w:val="91"/>
         </w:numPr>
+        <w:jc w:val="both"/>
         <w:rPr>
           <w:lang w:bidi="ar-EG"/>
         </w:rPr>
@@ -1258,7 +1321,7 @@
         <w:rPr>
           <w:lang w:bidi="ar-EG"/>
         </w:rPr>
-        <w:t>The degree of a square is defined as the number of legal knight moves from that square on an empty board , the number of squares a knight can reach in one move, ignoring whether those squares have been visited. For example, on an 8×8 board, a corner has degree 2 (even), a square one step from a corner has degree 3 (odd), and a central square has degree 8 (even).</w:t>
+        <w:t>The degree of a square is defined as the number of legal knight moves from that square on an empty board, the number of squares a knight can reach in one move, ignoring whether those squares have been visited. For example, on an 8×8 board, a corner has degree 2 (even), a square one step from a corner has degree 3 (odd), and a central square has degree 8 (even).</w:t>
       </w:r>
     </w:p>
     <w:p>
@@ -1278,30 +1341,29 @@
     </w:p>
     <w:p>
       <w:pPr>
+        <w:spacing w:after="160" w:line="259" w:lineRule="auto"/>
         <w:ind w:left="0"/>
         <w:rPr>
           <w:lang w:bidi="ar-EG"/>
         </w:rPr>
       </w:pPr>
+      <w:r>
+        <w:rPr>
+          <w:lang w:bidi="ar-EG"/>
+        </w:rPr>
+        <w:br w:type="page"/>
+      </w:r>
     </w:p>
     <w:p>
       <w:pPr>
-        <w:ind w:left="0"/>
-        <w:rPr>
-          <w:lang w:bidi="ar-EG"/>
-        </w:rPr>
-      </w:pPr>
-    </w:p>
-    <w:p>
-      <w:pPr>
         <w:pStyle w:val="Heading3"/>
       </w:pPr>
-      <w:bookmarkStart w:id="11" w:name="_Toc226693037"/>
+      <w:bookmarkStart w:id="10" w:name="_Toc226693037"/>
       <w:r>
         <w:lastRenderedPageBreak/>
         <w:t>Pseudo Code</w:t>
       </w:r>
-      <w:bookmarkEnd w:id="11"/>
+      <w:bookmarkEnd w:id="10"/>
       <w:r>
         <w:t xml:space="preserve"> </w:t>
       </w:r>
@@ -3430,7 +3492,7 @@
               </wp:anchor>
             </w:drawing>
           </mc:Choice>
-          <mc:Fallback xmlns:w16sdtfl="http://schemas.microsoft.com/office/word/2024/wordml/sdtformatlock">
+          <mc:Fallback>
             <w:pict>
               <v:shapetype w14:anchorId="25060C4D" id="_x0000_t202" coordsize="21600,21600" o:spt="202" path="m,l,21600r21600,l21600,xe">
                 <v:stroke joinstyle="miter"/>
@@ -3721,17 +3783,7 @@
                           <w:sz w:val="20"/>
                           <w:szCs w:val="20"/>
                         </w:rPr>
-                        <w:t>//</w:t>
-                      </w:r>
-                      <w:r>
-                        <w:rPr>
-                          <w:rFonts w:ascii="Times New Roman" w:hAnsi="Times New Roman" w:cs="Times New Roman"/>
-                          <w:i/>
-                          <w:iCs/>
-                          <w:sz w:val="20"/>
-                          <w:szCs w:val="20"/>
-                        </w:rPr>
-                        <w:t>lists all 8 possible L-shaped knight jumps</w:t>
+                        <w:t>//lists all 8 possible L-shaped knight jumps</w:t>
                       </w:r>
                     </w:p>
                     <w:p>
@@ -3754,15 +3806,7 @@
                           <w:sz w:val="22"/>
                           <w:szCs w:val="22"/>
                         </w:rPr>
-                        <w:t xml:space="preserve"> ← [(2,1),(1,2),(−1,2),(−2,1),(−2,−1),(−1,−2),(1,−2),(2,−1)]</w:t>
-                      </w:r>
-                      <w:r>
-                        <w:rPr>
-                          <w:rFonts w:ascii="Times New Roman" w:hAnsi="Times New Roman" w:cs="Times New Roman"/>
-                          <w:sz w:val="22"/>
-                          <w:szCs w:val="22"/>
-                        </w:rPr>
-                        <w:t xml:space="preserve"> </w:t>
+                        <w:t xml:space="preserve"> ← [(2,1),(1,2),(−1,2),(−2,1),(−2,−1),(−1,−2),(1,−2),(2,−1)] </w:t>
                       </w:r>
                       <w:r>
                         <w:rPr>
@@ -3792,17 +3836,7 @@
                           <w:sz w:val="20"/>
                           <w:szCs w:val="20"/>
                         </w:rPr>
-                        <w:t xml:space="preserve">// </w:t>
-                      </w:r>
-                      <w:r>
-                        <w:rPr>
-                          <w:rFonts w:ascii="Times New Roman" w:hAnsi="Times New Roman" w:cs="Times New Roman"/>
-                          <w:i/>
-                          <w:iCs/>
-                          <w:sz w:val="20"/>
-                          <w:szCs w:val="20"/>
-                        </w:rPr>
-                        <w:t>Before moving to any square, this checks three things: is (x, y) still inside the board, and has it not been visited yet</w:t>
+                        <w:t>// Before moving to any square, this checks three things: is (x, y) still inside the board, and has it not been visited yet</w:t>
                       </w:r>
                     </w:p>
                     <w:p>
@@ -4088,37 +4122,7 @@
                           <w:sz w:val="20"/>
                           <w:szCs w:val="20"/>
                         </w:rPr>
-                        <w:t xml:space="preserve">// </w:t>
-                      </w:r>
-                      <w:r>
-                        <w:rPr>
-                          <w:rFonts w:ascii="Times New Roman" w:hAnsi="Times New Roman" w:cs="Times New Roman"/>
-                          <w:i/>
-                          <w:iCs/>
-                          <w:sz w:val="20"/>
-                          <w:szCs w:val="20"/>
-                        </w:rPr>
-                        <w:t xml:space="preserve">counts how many moves the knight could make from </w:t>
-                      </w:r>
-                      <w:r>
-                        <w:rPr>
-                          <w:rFonts w:ascii="Times New Roman" w:hAnsi="Times New Roman" w:cs="Times New Roman"/>
-                          <w:i/>
-                          <w:iCs/>
-                          <w:sz w:val="20"/>
-                          <w:szCs w:val="20"/>
-                        </w:rPr>
-                        <w:t>candidate square</w:t>
-                      </w:r>
-                      <w:r>
-                        <w:rPr>
-                          <w:rFonts w:ascii="Times New Roman" w:hAnsi="Times New Roman" w:cs="Times New Roman"/>
-                          <w:i/>
-                          <w:iCs/>
-                          <w:sz w:val="20"/>
-                          <w:szCs w:val="20"/>
-                        </w:rPr>
-                        <w:t xml:space="preserve"> to other unvisited squares</w:t>
+                        <w:t>// counts how many moves the knight could make from candidate square to other unvisited squares</w:t>
                       </w:r>
                     </w:p>
                     <w:p>
@@ -4633,7 +4637,6 @@
                         </w:rPr>
                         <w:t xml:space="preserve"> ← 1 </w:t>
                       </w:r>
-                      <w:proofErr w:type="spellStart"/>
                       <w:r>
                         <w:rPr>
                           <w:rFonts w:ascii="Times New Roman" w:hAnsi="Times New Roman" w:cs="Times New Roman"/>
@@ -4654,7 +4657,6 @@
                         </w:rPr>
                         <w:t>n</w:t>
                       </w:r>
-                      <w:proofErr w:type="spellEnd"/>
                       <w:r>
                         <w:rPr>
                           <w:rFonts w:ascii="Times New Roman" w:hAnsi="Times New Roman" w:cs="Times New Roman"/>
@@ -5883,12 +5885,12 @@
       <w:pPr>
         <w:pStyle w:val="Heading3"/>
       </w:pPr>
-      <w:bookmarkStart w:id="12" w:name="_Toc226693038"/>
+      <w:bookmarkStart w:id="11" w:name="_Toc226693038"/>
       <w:r>
         <w:lastRenderedPageBreak/>
         <w:t>Implementational Code</w:t>
       </w:r>
-      <w:bookmarkEnd w:id="12"/>
+      <w:bookmarkEnd w:id="11"/>
       <w:r>
         <w:t xml:space="preserve"> </w:t>
       </w:r>
@@ -6044,7 +6046,13 @@
         <w:rPr>
           <w:lang w:bidi="ar-EG"/>
         </w:rPr>
-        <w:t>n is the board size entered by the user. board[100][100] is declared globally so every function can access it without passing it around. It supports boards up to 100×100.</w:t>
+        <w:t>n is the board size entered by the user</w:t>
+      </w:r>
+      <w:r>
+        <w:rPr>
+          <w:lang w:bidi="ar-EG"/>
+        </w:rPr>
+        <w:t>.</w:t>
       </w:r>
     </w:p>
     <w:p>
@@ -6062,7 +6070,43 @@
         <w:rPr>
           <w:lang w:bidi="ar-EG"/>
         </w:rPr>
-        <w:t>dx and dy are the 8 knight move offsets. Each index i represents one L-shaped jump — dx[i] is the row shift and dy[i] is the column shift</w:t>
+        <w:t>board[100][100] is declared globally so every function can access it without passing it around. It supports boards up to 100×100.</w:t>
+      </w:r>
+    </w:p>
+    <w:p>
+      <w:pPr>
+        <w:pStyle w:val="ListParagraph"/>
+        <w:numPr>
+          <w:ilvl w:val="1"/>
+          <w:numId w:val="95"/>
+        </w:numPr>
+        <w:rPr>
+          <w:lang w:bidi="ar-EG"/>
+        </w:rPr>
+      </w:pPr>
+      <w:r>
+        <w:rPr>
+          <w:lang w:bidi="ar-EG"/>
+        </w:rPr>
+        <w:t>dx and dy are the 8 knight move offsets. Each index i represents one L-shaped jump</w:t>
+      </w:r>
+      <w:r>
+        <w:rPr>
+          <w:lang w:bidi="ar-EG"/>
+        </w:rPr>
+        <w:t xml:space="preserve">, where </w:t>
+      </w:r>
+      <w:r>
+        <w:rPr>
+          <w:lang w:bidi="ar-EG"/>
+        </w:rPr>
+        <w:t>dx[i] is the row shift and dy[i] is the column shift</w:t>
+      </w:r>
+      <w:r>
+        <w:rPr>
+          <w:lang w:bidi="ar-EG"/>
+        </w:rPr>
+        <w:t>.</w:t>
       </w:r>
     </w:p>
     <w:p>
@@ -6407,6 +6451,8 @@
     </w:p>
     <w:p>
       <w:pPr>
+        <w:ind w:firstLine="720"/>
+        <w:jc w:val="both"/>
         <w:rPr>
           <w:lang w:bidi="ar-EG"/>
         </w:rPr>
@@ -6431,8 +6477,6 @@
       </w:r>
       <w:r>
         <w:rPr>
-          <w:b/>
-          <w:bCs/>
           <w:i/>
           <w:iCs/>
           <w:lang w:bidi="ar-EG"/>
@@ -6746,6 +6790,7 @@
           <w:ilvl w:val="0"/>
           <w:numId w:val="94"/>
         </w:numPr>
+        <w:jc w:val="both"/>
         <w:rPr>
           <w:lang w:bidi="ar-EG"/>
         </w:rPr>
@@ -6761,7 +6806,35 @@
           <w:lang w:bidi="ar-EG"/>
         </w:rPr>
         <w:noBreakHyphen/>
-        <w:t>specified starting square, which is marked with 0 to denote the first visited square. A counter, moves, records the number of successfully completed moves.</w:t>
+        <w:t>specified starting square, which is marked with 0 to denote the first visited square. A counter </w:t>
+      </w:r>
+      <w:r>
+        <w:rPr>
+          <w:lang w:bidi="ar-EG"/>
+        </w:rPr>
+        <w:t>“</w:t>
+      </w:r>
+      <w:r>
+        <w:rPr>
+          <w:i/>
+          <w:iCs/>
+          <w:lang w:bidi="ar-EG"/>
+        </w:rPr>
+        <w:t>moves</w:t>
+      </w:r>
+      <w:r>
+        <w:rPr>
+          <w:i/>
+          <w:iCs/>
+          <w:lang w:bidi="ar-EG"/>
+        </w:rPr>
+        <w:t>”</w:t>
+      </w:r>
+      <w:r>
+        <w:rPr>
+          <w:lang w:bidi="ar-EG"/>
+        </w:rPr>
+        <w:t xml:space="preserve"> records the number of successfully completed moves.</w:t>
       </w:r>
       <w:r>
         <w:rPr>
@@ -6777,6 +6850,7 @@
           <w:ilvl w:val="0"/>
           <w:numId w:val="94"/>
         </w:numPr>
+        <w:jc w:val="both"/>
         <w:rPr>
           <w:lang w:bidi="ar-EG"/>
         </w:rPr>
@@ -6816,7 +6890,19 @@
         <w:rPr>
           <w:lang w:bidi="ar-EG"/>
         </w:rPr>
-        <w:t xml:space="preserve"> is initialized to 9 because the maximum possible number of onward moves from any square is 8; thus any valid candidate will immediately yield a smaller value. </w:t>
+        <w:t xml:space="preserve"> is initialized to 9 because the maximum possible number of onward moves from any square is 8; </w:t>
+      </w:r>
+      <w:r>
+        <w:rPr>
+          <w:lang w:bidi="ar-EG"/>
+        </w:rPr>
+        <w:t>thus,</w:t>
+      </w:r>
+      <w:r>
+        <w:rPr>
+          <w:lang w:bidi="ar-EG"/>
+        </w:rPr>
+        <w:t xml:space="preserve"> any valid candidate will immediately yield a smaller value. </w:t>
       </w:r>
       <w:r>
         <w:rPr>
@@ -6832,6 +6918,7 @@
           <w:ilvl w:val="0"/>
           <w:numId w:val="94"/>
         </w:numPr>
+        <w:jc w:val="both"/>
         <w:rPr>
           <w:lang w:bidi="ar-EG"/>
         </w:rPr>
@@ -6904,6 +6991,7 @@
           <w:ilvl w:val="0"/>
           <w:numId w:val="94"/>
         </w:numPr>
+        <w:jc w:val="both"/>
         <w:rPr>
           <w:lang w:bidi="ar-EG"/>
         </w:rPr>
@@ -6944,6 +7032,7 @@
           <w:ilvl w:val="0"/>
           <w:numId w:val="94"/>
         </w:numPr>
+        <w:jc w:val="both"/>
         <w:rPr>
           <w:lang w:bidi="ar-EG"/>
         </w:rPr>
@@ -7038,6 +7127,7 @@
           <w:ilvl w:val="0"/>
           <w:numId w:val="94"/>
         </w:numPr>
+        <w:jc w:val="both"/>
         <w:rPr>
           <w:lang w:bidi="ar-EG"/>
         </w:rPr>
@@ -7086,7 +7176,7 @@
       <w:pPr>
         <w:pStyle w:val="Heading3"/>
       </w:pPr>
-      <w:bookmarkStart w:id="13" w:name="_Toc226693039"/>
+      <w:bookmarkStart w:id="12" w:name="_Toc226693039"/>
       <w:r>
         <w:lastRenderedPageBreak/>
         <w:t>Algorithm analysis</w:t>
@@ -7094,7 +7184,7 @@
       <w:r>
         <w:t xml:space="preserve"> – time &amp; space complexity</w:t>
       </w:r>
-      <w:bookmarkEnd w:id="13"/>
+      <w:bookmarkEnd w:id="12"/>
       <w:r>
         <w:t xml:space="preserve"> </w:t>
       </w:r>
@@ -7297,11 +7387,11 @@
       <w:pPr>
         <w:pStyle w:val="Heading2"/>
       </w:pPr>
-      <w:bookmarkStart w:id="14" w:name="_Toc226693040"/>
+      <w:bookmarkStart w:id="13" w:name="_Toc226693040"/>
       <w:r>
         <w:t>Sample outputs</w:t>
       </w:r>
-      <w:bookmarkEnd w:id="14"/>
+      <w:bookmarkEnd w:id="13"/>
     </w:p>
     <w:tbl>
       <w:tblPr>
@@ -8286,12 +8376,12 @@
       <w:pPr>
         <w:pStyle w:val="Heading2"/>
       </w:pPr>
-      <w:bookmarkStart w:id="15" w:name="_Toc226693041"/>
+      <w:bookmarkStart w:id="14" w:name="_Toc226693041"/>
       <w:r>
         <w:lastRenderedPageBreak/>
         <w:t>Answers to Task Questions’</w:t>
       </w:r>
-      <w:bookmarkEnd w:id="15"/>
+      <w:bookmarkEnd w:id="14"/>
     </w:p>
     <w:p>
       <w:r>
@@ -9642,45 +9732,77 @@
     </w:p>
     <w:p>
       <w:pPr>
+        <w:spacing w:after="160" w:line="259" w:lineRule="auto"/>
+        <w:ind w:left="0"/>
         <w:rPr>
           <w:rFonts w:eastAsiaTheme="minorEastAsia"/>
           <w:lang w:bidi="ar-EG"/>
         </w:rPr>
       </w:pPr>
+      <w:r>
+        <w:rPr>
+          <w:rFonts w:eastAsiaTheme="minorEastAsia"/>
+          <w:lang w:bidi="ar-EG"/>
+        </w:rPr>
+        <w:br w:type="page"/>
+      </w:r>
     </w:p>
     <w:p>
       <w:pPr>
         <w:pStyle w:val="Heading2"/>
       </w:pPr>
-      <w:bookmarkStart w:id="16" w:name="_Toc226693042"/>
-      <w:r>
+      <w:bookmarkStart w:id="15" w:name="_Toc226693042"/>
+      <w:r>
+        <w:lastRenderedPageBreak/>
         <w:t>Alternative</w:t>
       </w:r>
       <w:r>
         <w:t xml:space="preserve"> Solutions</w:t>
       </w:r>
-      <w:bookmarkEnd w:id="16"/>
+      <w:bookmarkEnd w:id="15"/>
     </w:p>
     <w:p>
       <w:pPr>
         <w:rPr>
-          <w:lang w:bidi="ar-EG"/>
-        </w:rPr>
-      </w:pPr>
-      <w:r>
-        <w:rPr>
           <w:b/>
           <w:bCs/>
           <w:lang w:bidi="ar-EG"/>
         </w:rPr>
+      </w:pPr>
+      <w:r>
+        <w:rPr>
+          <w:b/>
+          <w:bCs/>
+          <w:lang w:bidi="ar-EG"/>
+        </w:rPr>
         <w:t>Max-Degree Heuristic (MDH)</w:t>
       </w:r>
-      <w:r>
-        <w:rPr>
-          <w:lang w:bidi="ar-EG"/>
-        </w:rPr>
-        <w:br/>
-        <w:t>Selects the node with the maximum onward degree, aiming to maintain high mobility. This delays low</w:t>
+    </w:p>
+    <w:p>
+      <w:pPr>
+        <w:ind w:firstLine="720"/>
+        <w:jc w:val="both"/>
+        <w:rPr>
+          <w:lang w:bidi="ar-EG"/>
+        </w:rPr>
+      </w:pPr>
+      <w:r>
+        <w:rPr>
+          <w:lang w:bidi="ar-EG"/>
+        </w:rPr>
+        <w:t>Selects the node with the maximum onward degree, aiming to maintain high mobility. This</w:t>
+      </w:r>
+      <w:r>
+        <w:rPr>
+          <w:lang w:bidi="ar-EG"/>
+        </w:rPr>
+        <w:t xml:space="preserve">, in turn, </w:t>
+      </w:r>
+      <w:r>
+        <w:rPr>
+          <w:lang w:bidi="ar-EG"/>
+        </w:rPr>
+        <w:t xml:space="preserve"> delays low</w:t>
       </w:r>
       <w:r>
         <w:rPr>
@@ -9694,7 +9816,19 @@
           <w:lang w:bidi="ar-EG"/>
         </w:rPr>
         <w:noBreakHyphen/>
-        <w:t>ends – the opposite of Warnsdorff.</w:t>
+        <w:t>ends</w:t>
+      </w:r>
+      <w:r>
+        <w:rPr>
+          <w:lang w:bidi="ar-EG"/>
+        </w:rPr>
+        <w:t>, which is</w:t>
+      </w:r>
+      <w:r>
+        <w:rPr>
+          <w:lang w:bidi="ar-EG"/>
+        </w:rPr>
+        <w:t xml:space="preserve"> the opposite of Warnsdorff.</w:t>
       </w:r>
       <w:r>
         <w:rPr>
@@ -9705,23 +9839,34 @@
     </w:p>
     <w:p>
       <w:pPr>
-        <w:rPr>
-          <w:lang w:bidi="ar-EG"/>
-        </w:rPr>
-      </w:pPr>
-      <w:r>
+        <w:jc w:val="both"/>
         <w:rPr>
           <w:b/>
           <w:bCs/>
           <w:lang w:bidi="ar-EG"/>
         </w:rPr>
+      </w:pPr>
+      <w:r>
+        <w:rPr>
+          <w:b/>
+          <w:bCs/>
+          <w:lang w:bidi="ar-EG"/>
+        </w:rPr>
         <w:t>Edge-Avoidance Heuristic (EAH)</w:t>
       </w:r>
-      <w:r>
-        <w:rPr>
-          <w:lang w:bidi="ar-EG"/>
-        </w:rPr>
-        <w:br/>
+    </w:p>
+    <w:p>
+      <w:pPr>
+        <w:ind w:firstLine="720"/>
+        <w:jc w:val="both"/>
+        <w:rPr>
+          <w:lang w:bidi="ar-EG"/>
+        </w:rPr>
+      </w:pPr>
+      <w:r>
+        <w:rPr>
+          <w:lang w:bidi="ar-EG"/>
+        </w:rPr>
         <w:t>Avoids low</w:t>
       </w:r>
       <w:r>
@@ -9747,59 +9892,74 @@
     </w:p>
     <w:p>
       <w:pPr>
-        <w:rPr>
-          <w:lang w:bidi="ar-EG"/>
-        </w:rPr>
-      </w:pPr>
-      <w:r>
+        <w:jc w:val="both"/>
         <w:rPr>
           <w:b/>
           <w:bCs/>
           <w:lang w:bidi="ar-EG"/>
         </w:rPr>
+      </w:pPr>
+      <w:r>
+        <w:rPr>
+          <w:b/>
+          <w:bCs/>
+          <w:lang w:bidi="ar-EG"/>
+        </w:rPr>
         <w:t>Random Greedy (RG)</w:t>
-      </w:r>
-      <w:r>
-        <w:rPr>
-          <w:lang w:bidi="ar-EG"/>
-        </w:rPr>
-        <w:br/>
-        <w:t>Makes a random choice among all valid moves at each step. This avoids deterministic traps but offers no guarantee and is unstable; often used with multiple retries.</w:t>
-      </w:r>
-      <w:r>
-        <w:rPr>
-          <w:lang w:bidi="ar-EG"/>
-        </w:rPr>
-        <w:br/>
       </w:r>
     </w:p>
     <w:p>
       <w:pPr>
-        <w:rPr>
-          <w:lang w:bidi="ar-EG"/>
-        </w:rPr>
-      </w:pPr>
-      <w:r>
+        <w:ind w:firstLine="720"/>
+        <w:jc w:val="both"/>
+        <w:rPr>
+          <w:lang w:bidi="ar-EG"/>
+        </w:rPr>
+      </w:pPr>
+      <w:r>
+        <w:rPr>
+          <w:lang w:bidi="ar-EG"/>
+        </w:rPr>
+        <w:t>Makes a random choice among all valid moves at each step. This avoids deterministic traps but offers no guarantee and is unstable; often used with multiple retries.</w:t>
+      </w:r>
+      <w:r>
+        <w:rPr>
+          <w:lang w:bidi="ar-EG"/>
+        </w:rPr>
+        <w:br/>
+      </w:r>
+    </w:p>
+    <w:p>
+      <w:pPr>
+        <w:jc w:val="both"/>
         <w:rPr>
           <w:b/>
           <w:bCs/>
           <w:lang w:bidi="ar-EG"/>
         </w:rPr>
+      </w:pPr>
+      <w:r>
+        <w:rPr>
+          <w:b/>
+          <w:bCs/>
+          <w:lang w:bidi="ar-EG"/>
+        </w:rPr>
         <w:t>Hybrid Greedy (HG – Best Practical)</w:t>
       </w:r>
-      <w:r>
-        <w:rPr>
-          <w:lang w:bidi="ar-EG"/>
-        </w:rPr>
-        <w:br/>
-        <w:t>Combines Warnsdorff as the primary rule with tie</w:t>
-      </w:r>
-      <w:r>
-        <w:rPr>
-          <w:lang w:bidi="ar-EG"/>
-        </w:rPr>
-        <w:noBreakHyphen/>
-        <w:t>. This improves robustness, reduces failure cases, and is near</w:t>
+    </w:p>
+    <w:p>
+      <w:pPr>
+        <w:ind w:firstLine="720"/>
+        <w:jc w:val="both"/>
+        <w:rPr>
+          <w:lang w:bidi="ar-EG"/>
+        </w:rPr>
+      </w:pPr>
+      <w:r>
+        <w:rPr>
+          <w:lang w:bidi="ar-EG"/>
+        </w:rPr>
+        <w:t>Combines Warnsdorff as the primary rule with tie. This improves robustness, reduces failure cases, and is near</w:t>
       </w:r>
       <w:r>
         <w:rPr>
@@ -9811,44 +9971,33 @@
     </w:p>
     <w:p>
       <w:pPr>
-        <w:pStyle w:val="Heading2"/>
-      </w:pPr>
-      <w:bookmarkStart w:id="17" w:name="_Toc226693043"/>
-      <w:r>
-        <w:t>Key findings and insights</w:t>
-      </w:r>
-      <w:bookmarkEnd w:id="17"/>
-      <w:r>
-        <w:t xml:space="preserve"> </w:t>
-      </w:r>
+        <w:ind w:firstLine="720"/>
+        <w:jc w:val="both"/>
+        <w:rPr>
+          <w:lang w:bidi="ar-EG"/>
+        </w:rPr>
+      </w:pPr>
     </w:p>
     <w:p>
       <w:pPr>
-        <w:numPr>
-          <w:ilvl w:val="0"/>
-          <w:numId w:val="96"/>
-        </w:numPr>
-        <w:rPr>
-          <w:sz w:val="22"/>
-          <w:szCs w:val="22"/>
-          <w:lang w:bidi="ar-EG"/>
-        </w:rPr>
-      </w:pPr>
-      <w:r>
-        <w:rPr>
-          <w:sz w:val="22"/>
-          <w:szCs w:val="22"/>
-          <w:lang w:bidi="ar-EG"/>
-        </w:rPr>
-        <w:t>The knight’s tour can be modelled as a graph traversal problem, specifically that of finding a Hamiltonian path or cycle on the graph induced by the chessboard.</w:t>
-      </w:r>
-      <w:r>
-        <w:rPr>
-          <w:sz w:val="22"/>
-          <w:szCs w:val="22"/>
-          <w:lang w:bidi="ar-EG"/>
-        </w:rPr>
-        <w:br/>
+        <w:spacing w:after="160" w:line="259" w:lineRule="auto"/>
+        <w:ind w:left="0"/>
+        <w:rPr>
+          <w:lang w:bidi="ar-EG"/>
+        </w:rPr>
+      </w:pPr>
+    </w:p>
+    <w:p>
+      <w:pPr>
+        <w:pStyle w:val="Heading2"/>
+      </w:pPr>
+      <w:bookmarkStart w:id="16" w:name="_Toc226693043"/>
+      <w:r>
+        <w:t>Key findings and insights</w:t>
+      </w:r>
+      <w:bookmarkEnd w:id="16"/>
+      <w:r>
+        <w:t xml:space="preserve"> </w:t>
       </w:r>
     </w:p>
     <w:p>
@@ -9856,8 +10005,32 @@
         <w:pStyle w:val="ListParagraph"/>
         <w:numPr>
           <w:ilvl w:val="0"/>
-          <w:numId w:val="96"/>
+          <w:numId w:val="87"/>
         </w:numPr>
+        <w:jc w:val="both"/>
+        <w:rPr>
+          <w:sz w:val="22"/>
+          <w:szCs w:val="22"/>
+          <w:lang w:bidi="ar-EG"/>
+        </w:rPr>
+      </w:pPr>
+      <w:r>
+        <w:rPr>
+          <w:sz w:val="22"/>
+          <w:szCs w:val="22"/>
+          <w:lang w:bidi="ar-EG"/>
+        </w:rPr>
+        <w:t>The knight’s tour can be modelled as a graph traversal problem, specifically that of finding a Hamiltonian path or cycle on the graph induced by the chessboard.</w:t>
+      </w:r>
+    </w:p>
+    <w:p>
+      <w:pPr>
+        <w:pStyle w:val="ListParagraph"/>
+        <w:numPr>
+          <w:ilvl w:val="0"/>
+          <w:numId w:val="87"/>
+        </w:numPr>
+        <w:jc w:val="both"/>
         <w:rPr>
           <w:sz w:val="22"/>
           <w:szCs w:val="22"/>
@@ -9877,11 +10050,101 @@
       </w:r>
       <w:r>
         <w:rPr>
+          <w:b/>
+          <w:bCs/>
           <w:sz w:val="22"/>
           <w:szCs w:val="22"/>
           <w:lang w:bidi="ar-EG"/>
         </w:rPr>
-        <w:t xml:space="preserve"> Odd boards have unequal black/white squares — the knight can never return to its start color, making closed tours mathematically impossible for all odd n.</w:t>
+        <w:t xml:space="preserve"> </w:t>
+      </w:r>
+      <w:r>
+        <w:rPr>
+          <w:sz w:val="22"/>
+          <w:szCs w:val="22"/>
+          <w:lang w:bidi="ar-EG"/>
+        </w:rPr>
+        <w:t>because</w:t>
+      </w:r>
+      <w:r>
+        <w:rPr>
+          <w:sz w:val="22"/>
+          <w:szCs w:val="22"/>
+          <w:lang w:bidi="ar-EG"/>
+        </w:rPr>
+        <w:t xml:space="preserve"> </w:t>
+      </w:r>
+      <w:r>
+        <w:rPr>
+          <w:sz w:val="22"/>
+          <w:szCs w:val="22"/>
+          <w:lang w:bidi="ar-EG"/>
+        </w:rPr>
+        <w:t>o</w:t>
+      </w:r>
+      <w:r>
+        <w:rPr>
+          <w:sz w:val="22"/>
+          <w:szCs w:val="22"/>
+          <w:lang w:bidi="ar-EG"/>
+        </w:rPr>
+        <w:t>dd boards have unequal black/white squares</w:t>
+      </w:r>
+      <w:r>
+        <w:rPr>
+          <w:sz w:val="22"/>
+          <w:szCs w:val="22"/>
+          <w:lang w:bidi="ar-EG"/>
+        </w:rPr>
+        <w:t xml:space="preserve"> which </w:t>
+      </w:r>
+      <w:r>
+        <w:rPr>
+          <w:sz w:val="22"/>
+          <w:szCs w:val="22"/>
+          <w:lang w:bidi="ar-EG"/>
+        </w:rPr>
+        <w:t xml:space="preserve">disables </w:t>
+      </w:r>
+      <w:r>
+        <w:rPr>
+          <w:sz w:val="22"/>
+          <w:szCs w:val="22"/>
+          <w:lang w:bidi="ar-EG"/>
+        </w:rPr>
+        <w:t xml:space="preserve">the knight </w:t>
+      </w:r>
+      <w:r>
+        <w:rPr>
+          <w:sz w:val="22"/>
+          <w:szCs w:val="22"/>
+          <w:lang w:bidi="ar-EG"/>
+        </w:rPr>
+        <w:t xml:space="preserve">from </w:t>
+      </w:r>
+      <w:r>
+        <w:rPr>
+          <w:sz w:val="22"/>
+          <w:szCs w:val="22"/>
+          <w:lang w:bidi="ar-EG"/>
+        </w:rPr>
+        <w:t>return</w:t>
+      </w:r>
+      <w:r>
+        <w:rPr>
+          <w:sz w:val="22"/>
+          <w:szCs w:val="22"/>
+          <w:lang w:bidi="ar-EG"/>
+        </w:rPr>
+        <w:t>ing</w:t>
+      </w:r>
+      <w:r>
+        <w:rPr>
+          <w:sz w:val="22"/>
+          <w:szCs w:val="22"/>
+          <w:lang w:bidi="ar-EG"/>
+        </w:rPr>
+        <w:t xml:space="preserve"> to its start color, making closed tours mathematically impossible for all odd n.</w:t>
       </w:r>
     </w:p>
     <w:sectPr>
@@ -16151,7 +16414,7 @@
   <w:abstractNum w:abstractNumId="48" w15:restartNumberingAfterBreak="0">
     <w:nsid w:val="402764AC"/>
     <w:multiLevelType w:val="multilevel"/>
-    <w:tmpl w:val="EC2CE8AA"/>
+    <w:tmpl w:val="FF4EDF10"/>
     <w:lvl w:ilvl="0">
       <w:start w:val="1"/>
       <w:numFmt w:val="bullet"/>
@@ -16168,20 +16431,17 @@
         <w:sz w:val="20"/>
       </w:rPr>
     </w:lvl>
-    <w:lvl w:ilvl="1" w:tentative="1">
-      <w:start w:val="1"/>
-      <w:numFmt w:val="bullet"/>
-      <w:lvlText w:val="o"/>
-      <w:lvlJc w:val="left"/>
-      <w:pPr>
-        <w:tabs>
-          <w:tab w:val="num" w:pos="2160"/>
-        </w:tabs>
+    <w:lvl w:ilvl="1">
+      <w:start w:val="1"/>
+      <w:numFmt w:val="decimal"/>
+      <w:lvlText w:val="%2."/>
+      <w:lvlJc w:val="left"/>
+      <w:pPr>
         <w:ind w:left="2160" w:hanging="360"/>
       </w:pPr>
       <w:rPr>
-        <w:rFonts w:ascii="Courier New" w:hAnsi="Courier New" w:hint="default"/>
-        <w:sz w:val="20"/>
+        <w:rFonts w:hint="default"/>
+        <w:b/>
       </w:rPr>
     </w:lvl>
     <w:lvl w:ilvl="2" w:tentative="1">

</xml_diff>

<commit_message>
Add first 3 tasks to master
</commit_message>
<xml_diff>
--- a/Report/Task 02.docx
+++ b/Report/Task 02.docx
@@ -13,7 +13,10 @@
       </w:pPr>
       <w:bookmarkStart w:id="0" w:name="_Toc226693030"/>
       <w:r>
-        <w:t xml:space="preserve">Task 2 - </w:t>
+        <w:t>2.</w:t>
+      </w:r>
+      <w:r>
+        <w:t xml:space="preserve"> </w:t>
       </w:r>
       <w:r>
         <w:t>Knight’s Tour Problem</w:t>
@@ -26,6 +29,9 @@
         <w:spacing w:before="0"/>
       </w:pPr>
       <w:bookmarkStart w:id="1" w:name="_Toc226693031"/>
+      <w:r>
+        <w:t xml:space="preserve">2.1 </w:t>
+      </w:r>
       <w:r>
         <w:t>Background</w:t>
       </w:r>
@@ -330,6 +336,9 @@
       <w:bookmarkStart w:id="3" w:name="_Toc217598122"/>
       <w:bookmarkStart w:id="4" w:name="_Toc226693032"/>
       <w:r>
+        <w:t xml:space="preserve">2.2 </w:t>
+      </w:r>
+      <w:r>
         <w:t>Task</w:t>
       </w:r>
       <w:r>
@@ -338,7 +347,10 @@
       <w:bookmarkEnd w:id="2"/>
       <w:bookmarkEnd w:id="3"/>
       <w:r>
-        <w:t>Statement</w:t>
+        <w:t>s</w:t>
+      </w:r>
+      <w:r>
+        <w:t>tatement</w:t>
       </w:r>
       <w:bookmarkEnd w:id="4"/>
     </w:p>
@@ -626,13 +638,28 @@
       <w:bookmarkStart w:id="6" w:name="_Toc217598124"/>
       <w:bookmarkStart w:id="7" w:name="_Toc226693033"/>
       <w:r>
+        <w:t xml:space="preserve">2.3 </w:t>
+      </w:r>
+      <w:r>
         <w:t>Implement</w:t>
       </w:r>
       <w:r>
         <w:t>ed</w:t>
       </w:r>
       <w:r>
-        <w:t xml:space="preserve"> Key Features</w:t>
+        <w:t xml:space="preserve"> </w:t>
+      </w:r>
+      <w:r>
+        <w:t>k</w:t>
+      </w:r>
+      <w:r>
+        <w:t xml:space="preserve">ey </w:t>
+      </w:r>
+      <w:r>
+        <w:t>f</w:t>
+      </w:r>
+      <w:r>
+        <w:t>eatures</w:t>
       </w:r>
       <w:bookmarkEnd w:id="5"/>
       <w:bookmarkEnd w:id="6"/>
@@ -809,7 +836,16 @@
       <w:bookmarkStart w:id="8" w:name="_Toc226693034"/>
       <w:r>
         <w:lastRenderedPageBreak/>
-        <w:t>Comprehensive Description</w:t>
+        <w:t xml:space="preserve">2.4 </w:t>
+      </w:r>
+      <w:r>
+        <w:t xml:space="preserve">Comprehensive </w:t>
+      </w:r>
+      <w:r>
+        <w:t>d</w:t>
+      </w:r>
+      <w:r>
+        <w:t>escription</w:t>
       </w:r>
       <w:bookmarkEnd w:id="8"/>
       <w:r>
@@ -1099,7 +1135,16 @@
       </w:pPr>
       <w:bookmarkStart w:id="9" w:name="_Toc226693035"/>
       <w:r>
-        <w:t>Problem Solution</w:t>
+        <w:t xml:space="preserve">2.5 </w:t>
+      </w:r>
+      <w:r>
+        <w:t xml:space="preserve">Problem </w:t>
+      </w:r>
+      <w:r>
+        <w:t>s</w:t>
+      </w:r>
+      <w:r>
+        <w:t>olution</w:t>
       </w:r>
       <w:bookmarkEnd w:id="9"/>
       <w:r>
@@ -1110,6 +1155,9 @@
       <w:pPr>
         <w:pStyle w:val="Heading3"/>
       </w:pPr>
+      <w:r>
+        <w:t xml:space="preserve">2.5.1 </w:t>
+      </w:r>
       <w:r>
         <w:t>Methodology</w:t>
       </w:r>
@@ -1361,7 +1409,16 @@
       <w:bookmarkStart w:id="10" w:name="_Toc226693037"/>
       <w:r>
         <w:lastRenderedPageBreak/>
-        <w:t>Pseudo Code</w:t>
+        <w:t xml:space="preserve">2.5.2 </w:t>
+      </w:r>
+      <w:r>
+        <w:t>Pseudo</w:t>
+      </w:r>
+      <w:r>
+        <w:t>c</w:t>
+      </w:r>
+      <w:r>
+        <w:t>ode</w:t>
       </w:r>
       <w:bookmarkEnd w:id="10"/>
       <w:r>
@@ -5888,7 +5945,16 @@
       <w:bookmarkStart w:id="11" w:name="_Toc226693038"/>
       <w:r>
         <w:lastRenderedPageBreak/>
-        <w:t>Implementational Code</w:t>
+        <w:t xml:space="preserve">2.5.3 </w:t>
+      </w:r>
+      <w:r>
+        <w:t xml:space="preserve">Implementational </w:t>
+      </w:r>
+      <w:r>
+        <w:t>c</w:t>
+      </w:r>
+      <w:r>
+        <w:t>ode</w:t>
       </w:r>
       <w:bookmarkEnd w:id="11"/>
       <w:r>
@@ -5897,9 +5963,16 @@
     </w:p>
     <w:p>
       <w:pPr>
-        <w:pStyle w:val="Heading4"/>
-      </w:pPr>
-      <w:r>
+        <w:rPr>
+          <w:b/>
+          <w:bCs/>
+        </w:rPr>
+      </w:pPr>
+      <w:r>
+        <w:rPr>
+          <w:b/>
+          <w:bCs/>
+        </w:rPr>
         <w:t>Includes &amp; global variables</w:t>
       </w:r>
     </w:p>
@@ -6111,9 +6184,16 @@
     </w:p>
     <w:p>
       <w:pPr>
-        <w:pStyle w:val="Heading4"/>
-      </w:pPr>
-      <w:r>
+        <w:rPr>
+          <w:b/>
+          <w:bCs/>
+        </w:rPr>
+      </w:pPr>
+      <w:r>
+        <w:rPr>
+          <w:b/>
+          <w:bCs/>
+        </w:rPr>
         <w:t xml:space="preserve">Validation Function </w:t>
       </w:r>
     </w:p>
@@ -6318,9 +6398,16 @@
     </w:p>
     <w:p>
       <w:pPr>
-        <w:pStyle w:val="Heading4"/>
-      </w:pPr>
-      <w:r>
+        <w:rPr>
+          <w:b/>
+          <w:bCs/>
+        </w:rPr>
+      </w:pPr>
+      <w:r>
+        <w:rPr>
+          <w:b/>
+          <w:bCs/>
+        </w:rPr>
         <w:t xml:space="preserve">Degree Calculation </w:t>
       </w:r>
     </w:p>
@@ -6548,38 +6635,31 @@
     </w:p>
     <w:p>
       <w:pPr>
-        <w:rPr>
-          <w:lang w:bidi="ar-EG"/>
-        </w:rPr>
-      </w:pPr>
+        <w:spacing w:after="160" w:line="259" w:lineRule="auto"/>
+        <w:ind w:left="0"/>
+        <w:rPr>
+          <w:lang w:bidi="ar-EG"/>
+        </w:rPr>
+      </w:pPr>
+      <w:r>
+        <w:rPr>
+          <w:lang w:bidi="ar-EG"/>
+        </w:rPr>
+        <w:br w:type="page"/>
+      </w:r>
     </w:p>
     <w:p>
       <w:pPr>
         <w:rPr>
-          <w:lang w:bidi="ar-EG"/>
-        </w:rPr>
-      </w:pPr>
-    </w:p>
-    <w:p>
-      <w:pPr>
-        <w:rPr>
-          <w:lang w:bidi="ar-EG"/>
-        </w:rPr>
-      </w:pPr>
-    </w:p>
-    <w:p>
-      <w:pPr>
-        <w:ind w:left="0"/>
-        <w:rPr>
-          <w:lang w:bidi="ar-EG"/>
-        </w:rPr>
-      </w:pPr>
-    </w:p>
-    <w:p>
-      <w:pPr>
-        <w:pStyle w:val="Heading4"/>
-      </w:pPr>
-      <w:r>
+          <w:b/>
+          <w:bCs/>
+        </w:rPr>
+      </w:pPr>
+      <w:r>
+        <w:rPr>
+          <w:b/>
+          <w:bCs/>
+        </w:rPr>
         <w:lastRenderedPageBreak/>
         <w:t>Greedy Tour Construction</w:t>
       </w:r>
@@ -7174,11 +7254,14 @@
     </w:p>
     <w:p>
       <w:pPr>
-        <w:pStyle w:val="Heading3"/>
+        <w:pStyle w:val="Heading2"/>
       </w:pPr>
       <w:bookmarkStart w:id="12" w:name="_Toc226693039"/>
       <w:r>
         <w:lastRenderedPageBreak/>
+        <w:t xml:space="preserve">2.6 </w:t>
+      </w:r>
+      <w:r>
         <w:t>Algorithm analysis</w:t>
       </w:r>
       <w:r>
@@ -7387,1001 +7470,17 @@
       <w:pPr>
         <w:pStyle w:val="Heading2"/>
       </w:pPr>
-      <w:bookmarkStart w:id="13" w:name="_Toc226693040"/>
-      <w:r>
-        <w:t>Sample outputs</w:t>
+      <w:bookmarkStart w:id="13" w:name="_Toc226693041"/>
+      <w:r>
+        <w:t>2.</w:t>
+      </w:r>
+      <w:r>
+        <w:t>7</w:t>
+      </w:r>
+      <w:r>
+        <w:t xml:space="preserve"> Answers to task questions</w:t>
       </w:r>
       <w:bookmarkEnd w:id="13"/>
-    </w:p>
-    <w:tbl>
-      <w:tblPr>
-        <w:tblStyle w:val="TableGrid"/>
-        <w:tblW w:w="0" w:type="auto"/>
-        <w:tblInd w:w="445" w:type="dxa"/>
-        <w:tblLayout w:type="fixed"/>
-        <w:tblLook w:val="04A0" w:firstRow="1" w:lastRow="0" w:firstColumn="1" w:lastColumn="0" w:noHBand="0" w:noVBand="1"/>
-      </w:tblPr>
-      <w:tblGrid>
-        <w:gridCol w:w="1170"/>
-        <w:gridCol w:w="2739"/>
-        <w:gridCol w:w="6166"/>
-      </w:tblGrid>
-      <w:tr>
-        <w:trPr>
-          <w:trHeight w:val="747"/>
-        </w:trPr>
-        <w:tc>
-          <w:tcPr>
-            <w:tcW w:w="1170" w:type="dxa"/>
-            <w:shd w:val="clear" w:color="auto" w:fill="BFBFBF" w:themeFill="background1" w:themeFillShade="BF"/>
-            <w:vAlign w:val="center"/>
-          </w:tcPr>
-          <w:p>
-            <w:pPr>
-              <w:ind w:left="0"/>
-              <w:jc w:val="center"/>
-              <w:rPr>
-                <w:lang w:bidi="ar-EG"/>
-              </w:rPr>
-            </w:pPr>
-            <w:r>
-              <w:rPr>
-                <w:lang w:bidi="ar-EG"/>
-              </w:rPr>
-              <w:t>Test Case</w:t>
-            </w:r>
-          </w:p>
-        </w:tc>
-        <w:tc>
-          <w:tcPr>
-            <w:tcW w:w="2739" w:type="dxa"/>
-            <w:shd w:val="clear" w:color="auto" w:fill="BFBFBF" w:themeFill="background1" w:themeFillShade="BF"/>
-            <w:vAlign w:val="center"/>
-          </w:tcPr>
-          <w:p>
-            <w:pPr>
-              <w:ind w:left="0"/>
-              <w:jc w:val="center"/>
-              <w:rPr>
-                <w:lang w:bidi="ar-EG"/>
-              </w:rPr>
-            </w:pPr>
-            <w:r>
-              <w:rPr>
-                <w:lang w:bidi="ar-EG"/>
-              </w:rPr>
-              <w:t>Sample Output</w:t>
-            </w:r>
-          </w:p>
-        </w:tc>
-        <w:tc>
-          <w:tcPr>
-            <w:tcW w:w="6166" w:type="dxa"/>
-            <w:shd w:val="clear" w:color="auto" w:fill="BFBFBF" w:themeFill="background1" w:themeFillShade="BF"/>
-            <w:vAlign w:val="center"/>
-          </w:tcPr>
-          <w:p>
-            <w:pPr>
-              <w:ind w:left="0"/>
-              <w:jc w:val="center"/>
-              <w:rPr>
-                <w:lang w:bidi="ar-EG"/>
-              </w:rPr>
-            </w:pPr>
-            <w:r>
-              <w:rPr>
-                <w:lang w:bidi="ar-EG"/>
-              </w:rPr>
-              <w:t>Visualizing (AI generated)</w:t>
-            </w:r>
-          </w:p>
-        </w:tc>
-      </w:tr>
-      <w:tr>
-        <w:trPr>
-          <w:trHeight w:val="2057"/>
-        </w:trPr>
-        <w:tc>
-          <w:tcPr>
-            <w:tcW w:w="1170" w:type="dxa"/>
-            <w:vAlign w:val="center"/>
-          </w:tcPr>
-          <w:p>
-            <w:pPr>
-              <w:ind w:left="0"/>
-              <w:jc w:val="center"/>
-              <w:rPr>
-                <w:lang w:bidi="ar-EG"/>
-              </w:rPr>
-            </w:pPr>
-            <w:r>
-              <w:rPr>
-                <w:lang w:bidi="ar-EG"/>
-              </w:rPr>
-              <w:t>1</w:t>
-            </w:r>
-          </w:p>
-        </w:tc>
-        <w:tc>
-          <w:tcPr>
-            <w:tcW w:w="2739" w:type="dxa"/>
-            <w:vAlign w:val="center"/>
-          </w:tcPr>
-          <w:p>
-            <w:pPr>
-              <w:ind w:left="0"/>
-              <w:jc w:val="center"/>
-              <w:rPr>
-                <w:lang w:bidi="ar-EG"/>
-              </w:rPr>
-            </w:pPr>
-            <w:r>
-              <w:rPr>
-                <w:noProof/>
-                <w:lang w:bidi="ar-EG"/>
-              </w:rPr>
-              <w:drawing>
-                <wp:anchor distT="0" distB="0" distL="114300" distR="114300" simplePos="0" relativeHeight="251660288" behindDoc="1" locked="0" layoutInCell="1" allowOverlap="1" wp14:anchorId="1C42DB01" wp14:editId="065AA696">
-                  <wp:simplePos x="0" y="0"/>
-                  <wp:positionH relativeFrom="column">
-                    <wp:posOffset>-12065</wp:posOffset>
-                  </wp:positionH>
-                  <wp:positionV relativeFrom="paragraph">
-                    <wp:posOffset>-1114425</wp:posOffset>
-                  </wp:positionV>
-                  <wp:extent cx="1696720" cy="1143000"/>
-                  <wp:effectExtent l="0" t="0" r="0" b="0"/>
-                  <wp:wrapTight wrapText="bothSides">
-                    <wp:wrapPolygon edited="0">
-                      <wp:start x="0" y="0"/>
-                      <wp:lineTo x="0" y="21240"/>
-                      <wp:lineTo x="21341" y="21240"/>
-                      <wp:lineTo x="21341" y="0"/>
-                      <wp:lineTo x="0" y="0"/>
-                    </wp:wrapPolygon>
-                  </wp:wrapTight>
-                  <wp:docPr id="342737330" name="Picture 1"/>
-                  <wp:cNvGraphicFramePr>
-                    <a:graphicFrameLocks xmlns:a="http://schemas.openxmlformats.org/drawingml/2006/main" noChangeAspect="1"/>
-                  </wp:cNvGraphicFramePr>
-                  <a:graphic xmlns:a="http://schemas.openxmlformats.org/drawingml/2006/main">
-                    <a:graphicData uri="http://schemas.openxmlformats.org/drawingml/2006/picture">
-                      <pic:pic xmlns:pic="http://schemas.openxmlformats.org/drawingml/2006/picture">
-                        <pic:nvPicPr>
-                          <pic:cNvPr id="342737330" name=""/>
-                          <pic:cNvPicPr/>
-                        </pic:nvPicPr>
-                        <pic:blipFill>
-                          <a:blip r:embed="rId12">
-                            <a:extLst>
-                              <a:ext uri="{28A0092B-C50C-407E-A947-70E740481C1C}">
-                                <a14:useLocalDpi xmlns:a14="http://schemas.microsoft.com/office/drawing/2010/main" val="0"/>
-                              </a:ext>
-                            </a:extLst>
-                          </a:blip>
-                          <a:stretch>
-                            <a:fillRect/>
-                          </a:stretch>
-                        </pic:blipFill>
-                        <pic:spPr>
-                          <a:xfrm>
-                            <a:off x="0" y="0"/>
-                            <a:ext cx="1696720" cy="1143000"/>
-                          </a:xfrm>
-                          <a:prstGeom prst="rect">
-                            <a:avLst/>
-                          </a:prstGeom>
-                        </pic:spPr>
-                      </pic:pic>
-                    </a:graphicData>
-                  </a:graphic>
-                  <wp14:sizeRelH relativeFrom="margin">
-                    <wp14:pctWidth>0</wp14:pctWidth>
-                  </wp14:sizeRelH>
-                  <wp14:sizeRelV relativeFrom="margin">
-                    <wp14:pctHeight>0</wp14:pctHeight>
-                  </wp14:sizeRelV>
-                </wp:anchor>
-              </w:drawing>
-            </w:r>
-          </w:p>
-        </w:tc>
-        <w:tc>
-          <w:tcPr>
-            <w:tcW w:w="6166" w:type="dxa"/>
-            <w:vAlign w:val="center"/>
-          </w:tcPr>
-          <w:p>
-            <w:pPr>
-              <w:ind w:left="0"/>
-              <w:jc w:val="center"/>
-              <w:rPr>
-                <w:lang w:bidi="ar-EG"/>
-              </w:rPr>
-            </w:pPr>
-            <w:r>
-              <w:rPr>
-                <w:noProof/>
-                <w:lang w:bidi="ar-EG"/>
-              </w:rPr>
-              <w:drawing>
-                <wp:inline distT="0" distB="0" distL="0" distR="0" wp14:anchorId="7A024738" wp14:editId="3C9ECAF8">
-                  <wp:extent cx="3810000" cy="2159000"/>
-                  <wp:effectExtent l="0" t="0" r="0" b="0"/>
-                  <wp:docPr id="1271415717" name="Picture 1"/>
-                  <wp:cNvGraphicFramePr>
-                    <a:graphicFrameLocks xmlns:a="http://schemas.openxmlformats.org/drawingml/2006/main" noChangeAspect="1"/>
-                  </wp:cNvGraphicFramePr>
-                  <a:graphic xmlns:a="http://schemas.openxmlformats.org/drawingml/2006/main">
-                    <a:graphicData uri="http://schemas.openxmlformats.org/drawingml/2006/picture">
-                      <pic:pic xmlns:pic="http://schemas.openxmlformats.org/drawingml/2006/picture">
-                        <pic:nvPicPr>
-                          <pic:cNvPr id="1271415717" name=""/>
-                          <pic:cNvPicPr/>
-                        </pic:nvPicPr>
-                        <pic:blipFill>
-                          <a:blip r:embed="rId13"/>
-                          <a:stretch>
-                            <a:fillRect/>
-                          </a:stretch>
-                        </pic:blipFill>
-                        <pic:spPr>
-                          <a:xfrm>
-                            <a:off x="0" y="0"/>
-                            <a:ext cx="3810000" cy="2159000"/>
-                          </a:xfrm>
-                          <a:prstGeom prst="rect">
-                            <a:avLst/>
-                          </a:prstGeom>
-                        </pic:spPr>
-                      </pic:pic>
-                    </a:graphicData>
-                  </a:graphic>
-                </wp:inline>
-              </w:drawing>
-            </w:r>
-          </w:p>
-        </w:tc>
-      </w:tr>
-      <w:tr>
-        <w:trPr>
-          <w:trHeight w:val="1979"/>
-        </w:trPr>
-        <w:tc>
-          <w:tcPr>
-            <w:tcW w:w="1170" w:type="dxa"/>
-            <w:vAlign w:val="center"/>
-          </w:tcPr>
-          <w:p>
-            <w:pPr>
-              <w:ind w:left="0"/>
-              <w:jc w:val="center"/>
-              <w:rPr>
-                <w:lang w:bidi="ar-EG"/>
-              </w:rPr>
-            </w:pPr>
-            <w:r>
-              <w:rPr>
-                <w:lang w:bidi="ar-EG"/>
-              </w:rPr>
-              <w:t>2</w:t>
-            </w:r>
-          </w:p>
-        </w:tc>
-        <w:tc>
-          <w:tcPr>
-            <w:tcW w:w="2739" w:type="dxa"/>
-            <w:vAlign w:val="center"/>
-          </w:tcPr>
-          <w:p>
-            <w:pPr>
-              <w:ind w:left="0"/>
-              <w:jc w:val="center"/>
-              <w:rPr>
-                <w:lang w:bidi="ar-EG"/>
-              </w:rPr>
-            </w:pPr>
-            <w:r>
-              <w:rPr>
-                <w:noProof/>
-                <w:lang w:bidi="ar-EG"/>
-              </w:rPr>
-              <w:drawing>
-                <wp:inline distT="0" distB="0" distL="0" distR="0" wp14:anchorId="561CF1C3" wp14:editId="2F73B748">
-                  <wp:extent cx="2072820" cy="853514"/>
-                  <wp:effectExtent l="0" t="0" r="3810" b="3810"/>
-                  <wp:docPr id="742541119" name="Picture 1"/>
-                  <wp:cNvGraphicFramePr>
-                    <a:graphicFrameLocks xmlns:a="http://schemas.openxmlformats.org/drawingml/2006/main" noChangeAspect="1"/>
-                  </wp:cNvGraphicFramePr>
-                  <a:graphic xmlns:a="http://schemas.openxmlformats.org/drawingml/2006/main">
-                    <a:graphicData uri="http://schemas.openxmlformats.org/drawingml/2006/picture">
-                      <pic:pic xmlns:pic="http://schemas.openxmlformats.org/drawingml/2006/picture">
-                        <pic:nvPicPr>
-                          <pic:cNvPr id="742541119" name=""/>
-                          <pic:cNvPicPr/>
-                        </pic:nvPicPr>
-                        <pic:blipFill>
-                          <a:blip r:embed="rId14"/>
-                          <a:stretch>
-                            <a:fillRect/>
-                          </a:stretch>
-                        </pic:blipFill>
-                        <pic:spPr>
-                          <a:xfrm>
-                            <a:off x="0" y="0"/>
-                            <a:ext cx="2072820" cy="853514"/>
-                          </a:xfrm>
-                          <a:prstGeom prst="rect">
-                            <a:avLst/>
-                          </a:prstGeom>
-                        </pic:spPr>
-                      </pic:pic>
-                    </a:graphicData>
-                  </a:graphic>
-                </wp:inline>
-              </w:drawing>
-            </w:r>
-          </w:p>
-        </w:tc>
-        <w:tc>
-          <w:tcPr>
-            <w:tcW w:w="6166" w:type="dxa"/>
-            <w:vAlign w:val="center"/>
-          </w:tcPr>
-          <w:p>
-            <w:pPr>
-              <w:ind w:left="0"/>
-              <w:jc w:val="center"/>
-              <w:rPr>
-                <w:lang w:bidi="ar-EG"/>
-              </w:rPr>
-            </w:pPr>
-            <w:r>
-              <w:rPr>
-                <w:noProof/>
-                <w:lang w:bidi="ar-EG"/>
-              </w:rPr>
-              <w:drawing>
-                <wp:inline distT="0" distB="0" distL="0" distR="0" wp14:anchorId="5F29E1A5" wp14:editId="63F7BC62">
-                  <wp:extent cx="3810000" cy="2527300"/>
-                  <wp:effectExtent l="0" t="0" r="0" b="6350"/>
-                  <wp:docPr id="883427239" name="Picture 1"/>
-                  <wp:cNvGraphicFramePr>
-                    <a:graphicFrameLocks xmlns:a="http://schemas.openxmlformats.org/drawingml/2006/main" noChangeAspect="1"/>
-                  </wp:cNvGraphicFramePr>
-                  <a:graphic xmlns:a="http://schemas.openxmlformats.org/drawingml/2006/main">
-                    <a:graphicData uri="http://schemas.openxmlformats.org/drawingml/2006/picture">
-                      <pic:pic xmlns:pic="http://schemas.openxmlformats.org/drawingml/2006/picture">
-                        <pic:nvPicPr>
-                          <pic:cNvPr id="883427239" name=""/>
-                          <pic:cNvPicPr/>
-                        </pic:nvPicPr>
-                        <pic:blipFill>
-                          <a:blip r:embed="rId15"/>
-                          <a:stretch>
-                            <a:fillRect/>
-                          </a:stretch>
-                        </pic:blipFill>
-                        <pic:spPr>
-                          <a:xfrm>
-                            <a:off x="0" y="0"/>
-                            <a:ext cx="3810000" cy="2527300"/>
-                          </a:xfrm>
-                          <a:prstGeom prst="rect">
-                            <a:avLst/>
-                          </a:prstGeom>
-                        </pic:spPr>
-                      </pic:pic>
-                    </a:graphicData>
-                  </a:graphic>
-                </wp:inline>
-              </w:drawing>
-            </w:r>
-          </w:p>
-        </w:tc>
-      </w:tr>
-      <w:tr>
-        <w:trPr>
-          <w:trHeight w:val="2057"/>
-        </w:trPr>
-        <w:tc>
-          <w:tcPr>
-            <w:tcW w:w="1170" w:type="dxa"/>
-            <w:vAlign w:val="center"/>
-          </w:tcPr>
-          <w:p>
-            <w:pPr>
-              <w:ind w:left="0"/>
-              <w:jc w:val="center"/>
-              <w:rPr>
-                <w:lang w:bidi="ar-EG"/>
-              </w:rPr>
-            </w:pPr>
-            <w:r>
-              <w:rPr>
-                <w:lang w:bidi="ar-EG"/>
-              </w:rPr>
-              <w:t>3</w:t>
-            </w:r>
-          </w:p>
-        </w:tc>
-        <w:tc>
-          <w:tcPr>
-            <w:tcW w:w="2739" w:type="dxa"/>
-            <w:vAlign w:val="center"/>
-          </w:tcPr>
-          <w:p>
-            <w:pPr>
-              <w:ind w:left="0"/>
-              <w:jc w:val="center"/>
-              <w:rPr>
-                <w:lang w:bidi="ar-EG"/>
-              </w:rPr>
-            </w:pPr>
-            <w:r>
-              <w:rPr>
-                <w:noProof/>
-                <w:lang w:bidi="ar-EG"/>
-              </w:rPr>
-              <w:drawing>
-                <wp:inline distT="0" distB="0" distL="0" distR="0" wp14:anchorId="18BD578A" wp14:editId="32D40C92">
-                  <wp:extent cx="1716405" cy="686435"/>
-                  <wp:effectExtent l="0" t="0" r="0" b="0"/>
-                  <wp:docPr id="866643971" name="Picture 1"/>
-                  <wp:cNvGraphicFramePr>
-                    <a:graphicFrameLocks xmlns:a="http://schemas.openxmlformats.org/drawingml/2006/main" noChangeAspect="1"/>
-                  </wp:cNvGraphicFramePr>
-                  <a:graphic xmlns:a="http://schemas.openxmlformats.org/drawingml/2006/main">
-                    <a:graphicData uri="http://schemas.openxmlformats.org/drawingml/2006/picture">
-                      <pic:pic xmlns:pic="http://schemas.openxmlformats.org/drawingml/2006/picture">
-                        <pic:nvPicPr>
-                          <pic:cNvPr id="866643971" name=""/>
-                          <pic:cNvPicPr/>
-                        </pic:nvPicPr>
-                        <pic:blipFill>
-                          <a:blip r:embed="rId16"/>
-                          <a:stretch>
-                            <a:fillRect/>
-                          </a:stretch>
-                        </pic:blipFill>
-                        <pic:spPr>
-                          <a:xfrm>
-                            <a:off x="0" y="0"/>
-                            <a:ext cx="1716405" cy="686435"/>
-                          </a:xfrm>
-                          <a:prstGeom prst="rect">
-                            <a:avLst/>
-                          </a:prstGeom>
-                        </pic:spPr>
-                      </pic:pic>
-                    </a:graphicData>
-                  </a:graphic>
-                </wp:inline>
-              </w:drawing>
-            </w:r>
-          </w:p>
-        </w:tc>
-        <w:tc>
-          <w:tcPr>
-            <w:tcW w:w="6166" w:type="dxa"/>
-            <w:vAlign w:val="center"/>
-          </w:tcPr>
-          <w:p>
-            <w:pPr>
-              <w:ind w:left="0"/>
-              <w:jc w:val="center"/>
-              <w:rPr>
-                <w:lang w:bidi="ar-EG"/>
-              </w:rPr>
-            </w:pPr>
-            <w:r>
-              <w:rPr>
-                <w:noProof/>
-                <w:lang w:bidi="ar-EG"/>
-              </w:rPr>
-              <w:drawing>
-                <wp:inline distT="0" distB="0" distL="0" distR="0" wp14:anchorId="2E4E6625" wp14:editId="7AE1C4FA">
-                  <wp:extent cx="3778250" cy="2305050"/>
-                  <wp:effectExtent l="0" t="0" r="0" b="0"/>
-                  <wp:docPr id="2002354459" name="Picture 1"/>
-                  <wp:cNvGraphicFramePr>
-                    <a:graphicFrameLocks xmlns:a="http://schemas.openxmlformats.org/drawingml/2006/main" noChangeAspect="1"/>
-                  </wp:cNvGraphicFramePr>
-                  <a:graphic xmlns:a="http://schemas.openxmlformats.org/drawingml/2006/main">
-                    <a:graphicData uri="http://schemas.openxmlformats.org/drawingml/2006/picture">
-                      <pic:pic xmlns:pic="http://schemas.openxmlformats.org/drawingml/2006/picture">
-                        <pic:nvPicPr>
-                          <pic:cNvPr id="2002354459" name=""/>
-                          <pic:cNvPicPr/>
-                        </pic:nvPicPr>
-                        <pic:blipFill>
-                          <a:blip r:embed="rId17"/>
-                          <a:stretch>
-                            <a:fillRect/>
-                          </a:stretch>
-                        </pic:blipFill>
-                        <pic:spPr>
-                          <a:xfrm>
-                            <a:off x="0" y="0"/>
-                            <a:ext cx="3778250" cy="2305050"/>
-                          </a:xfrm>
-                          <a:prstGeom prst="rect">
-                            <a:avLst/>
-                          </a:prstGeom>
-                        </pic:spPr>
-                      </pic:pic>
-                    </a:graphicData>
-                  </a:graphic>
-                </wp:inline>
-              </w:drawing>
-            </w:r>
-          </w:p>
-        </w:tc>
-      </w:tr>
-      <w:tr>
-        <w:trPr>
-          <w:trHeight w:val="2057"/>
-        </w:trPr>
-        <w:tc>
-          <w:tcPr>
-            <w:tcW w:w="1170" w:type="dxa"/>
-            <w:vAlign w:val="center"/>
-          </w:tcPr>
-          <w:p>
-            <w:pPr>
-              <w:ind w:left="0"/>
-              <w:jc w:val="center"/>
-              <w:rPr>
-                <w:lang w:bidi="ar-EG"/>
-              </w:rPr>
-            </w:pPr>
-            <w:r>
-              <w:rPr>
-                <w:lang w:bidi="ar-EG"/>
-              </w:rPr>
-              <w:lastRenderedPageBreak/>
-              <w:t>4</w:t>
-            </w:r>
-          </w:p>
-        </w:tc>
-        <w:tc>
-          <w:tcPr>
-            <w:tcW w:w="2739" w:type="dxa"/>
-            <w:vAlign w:val="center"/>
-          </w:tcPr>
-          <w:p>
-            <w:pPr>
-              <w:ind w:left="0"/>
-              <w:jc w:val="center"/>
-              <w:rPr>
-                <w:lang w:bidi="ar-EG"/>
-              </w:rPr>
-            </w:pPr>
-            <w:r>
-              <w:rPr>
-                <w:noProof/>
-                <w:lang w:bidi="ar-EG"/>
-              </w:rPr>
-              <w:drawing>
-                <wp:inline distT="0" distB="0" distL="0" distR="0" wp14:anchorId="5EEDB4F7" wp14:editId="60444FA8">
-                  <wp:extent cx="1716405" cy="701040"/>
-                  <wp:effectExtent l="0" t="0" r="0" b="3810"/>
-                  <wp:docPr id="567261073" name="Picture 1"/>
-                  <wp:cNvGraphicFramePr>
-                    <a:graphicFrameLocks xmlns:a="http://schemas.openxmlformats.org/drawingml/2006/main" noChangeAspect="1"/>
-                  </wp:cNvGraphicFramePr>
-                  <a:graphic xmlns:a="http://schemas.openxmlformats.org/drawingml/2006/main">
-                    <a:graphicData uri="http://schemas.openxmlformats.org/drawingml/2006/picture">
-                      <pic:pic xmlns:pic="http://schemas.openxmlformats.org/drawingml/2006/picture">
-                        <pic:nvPicPr>
-                          <pic:cNvPr id="567261073" name=""/>
-                          <pic:cNvPicPr/>
-                        </pic:nvPicPr>
-                        <pic:blipFill>
-                          <a:blip r:embed="rId18"/>
-                          <a:stretch>
-                            <a:fillRect/>
-                          </a:stretch>
-                        </pic:blipFill>
-                        <pic:spPr>
-                          <a:xfrm>
-                            <a:off x="0" y="0"/>
-                            <a:ext cx="1716405" cy="701040"/>
-                          </a:xfrm>
-                          <a:prstGeom prst="rect">
-                            <a:avLst/>
-                          </a:prstGeom>
-                        </pic:spPr>
-                      </pic:pic>
-                    </a:graphicData>
-                  </a:graphic>
-                </wp:inline>
-              </w:drawing>
-            </w:r>
-          </w:p>
-        </w:tc>
-        <w:tc>
-          <w:tcPr>
-            <w:tcW w:w="6166" w:type="dxa"/>
-            <w:vAlign w:val="center"/>
-          </w:tcPr>
-          <w:p>
-            <w:pPr>
-              <w:ind w:left="0"/>
-              <w:jc w:val="center"/>
-              <w:rPr>
-                <w:lang w:bidi="ar-EG"/>
-              </w:rPr>
-            </w:pPr>
-            <w:r>
-              <w:rPr>
-                <w:noProof/>
-                <w:lang w:bidi="ar-EG"/>
-              </w:rPr>
-              <w:drawing>
-                <wp:inline distT="0" distB="0" distL="0" distR="0" wp14:anchorId="1357E080" wp14:editId="3D469C24">
-                  <wp:extent cx="3778250" cy="2743200"/>
-                  <wp:effectExtent l="0" t="0" r="0" b="0"/>
-                  <wp:docPr id="59180424" name="Picture 1"/>
-                  <wp:cNvGraphicFramePr>
-                    <a:graphicFrameLocks xmlns:a="http://schemas.openxmlformats.org/drawingml/2006/main" noChangeAspect="1"/>
-                  </wp:cNvGraphicFramePr>
-                  <a:graphic xmlns:a="http://schemas.openxmlformats.org/drawingml/2006/main">
-                    <a:graphicData uri="http://schemas.openxmlformats.org/drawingml/2006/picture">
-                      <pic:pic xmlns:pic="http://schemas.openxmlformats.org/drawingml/2006/picture">
-                        <pic:nvPicPr>
-                          <pic:cNvPr id="59180424" name=""/>
-                          <pic:cNvPicPr/>
-                        </pic:nvPicPr>
-                        <pic:blipFill>
-                          <a:blip r:embed="rId19"/>
-                          <a:stretch>
-                            <a:fillRect/>
-                          </a:stretch>
-                        </pic:blipFill>
-                        <pic:spPr>
-                          <a:xfrm>
-                            <a:off x="0" y="0"/>
-                            <a:ext cx="3778250" cy="2743200"/>
-                          </a:xfrm>
-                          <a:prstGeom prst="rect">
-                            <a:avLst/>
-                          </a:prstGeom>
-                        </pic:spPr>
-                      </pic:pic>
-                    </a:graphicData>
-                  </a:graphic>
-                </wp:inline>
-              </w:drawing>
-            </w:r>
-          </w:p>
-        </w:tc>
-      </w:tr>
-      <w:tr>
-        <w:trPr>
-          <w:trHeight w:val="2057"/>
-        </w:trPr>
-        <w:tc>
-          <w:tcPr>
-            <w:tcW w:w="1170" w:type="dxa"/>
-            <w:vAlign w:val="center"/>
-          </w:tcPr>
-          <w:p>
-            <w:pPr>
-              <w:ind w:left="0"/>
-              <w:jc w:val="center"/>
-              <w:rPr>
-                <w:lang w:bidi="ar-EG"/>
-              </w:rPr>
-            </w:pPr>
-            <w:r>
-              <w:rPr>
-                <w:lang w:bidi="ar-EG"/>
-              </w:rPr>
-              <w:t>5</w:t>
-            </w:r>
-          </w:p>
-        </w:tc>
-        <w:tc>
-          <w:tcPr>
-            <w:tcW w:w="2739" w:type="dxa"/>
-            <w:vAlign w:val="center"/>
-          </w:tcPr>
-          <w:p>
-            <w:pPr>
-              <w:ind w:left="0"/>
-              <w:jc w:val="center"/>
-              <w:rPr>
-                <w:lang w:bidi="ar-EG"/>
-              </w:rPr>
-            </w:pPr>
-            <w:r>
-              <w:rPr>
-                <w:noProof/>
-                <w:lang w:bidi="ar-EG"/>
-              </w:rPr>
-              <w:drawing>
-                <wp:inline distT="0" distB="0" distL="0" distR="0" wp14:anchorId="3C917327" wp14:editId="32FB726A">
-                  <wp:extent cx="1716405" cy="758825"/>
-                  <wp:effectExtent l="0" t="0" r="0" b="3175"/>
-                  <wp:docPr id="1134705241" name="Picture 1"/>
-                  <wp:cNvGraphicFramePr>
-                    <a:graphicFrameLocks xmlns:a="http://schemas.openxmlformats.org/drawingml/2006/main" noChangeAspect="1"/>
-                  </wp:cNvGraphicFramePr>
-                  <a:graphic xmlns:a="http://schemas.openxmlformats.org/drawingml/2006/main">
-                    <a:graphicData uri="http://schemas.openxmlformats.org/drawingml/2006/picture">
-                      <pic:pic xmlns:pic="http://schemas.openxmlformats.org/drawingml/2006/picture">
-                        <pic:nvPicPr>
-                          <pic:cNvPr id="1134705241" name=""/>
-                          <pic:cNvPicPr/>
-                        </pic:nvPicPr>
-                        <pic:blipFill>
-                          <a:blip r:embed="rId20"/>
-                          <a:stretch>
-                            <a:fillRect/>
-                          </a:stretch>
-                        </pic:blipFill>
-                        <pic:spPr>
-                          <a:xfrm>
-                            <a:off x="0" y="0"/>
-                            <a:ext cx="1716405" cy="758825"/>
-                          </a:xfrm>
-                          <a:prstGeom prst="rect">
-                            <a:avLst/>
-                          </a:prstGeom>
-                        </pic:spPr>
-                      </pic:pic>
-                    </a:graphicData>
-                  </a:graphic>
-                </wp:inline>
-              </w:drawing>
-            </w:r>
-          </w:p>
-        </w:tc>
-        <w:tc>
-          <w:tcPr>
-            <w:tcW w:w="6166" w:type="dxa"/>
-            <w:vAlign w:val="center"/>
-          </w:tcPr>
-          <w:p>
-            <w:pPr>
-              <w:ind w:left="0"/>
-              <w:jc w:val="center"/>
-              <w:rPr>
-                <w:lang w:bidi="ar-EG"/>
-              </w:rPr>
-            </w:pPr>
-            <w:r>
-              <w:rPr>
-                <w:noProof/>
-                <w:lang w:bidi="ar-EG"/>
-              </w:rPr>
-              <w:drawing>
-                <wp:inline distT="0" distB="0" distL="0" distR="0" wp14:anchorId="43317B73" wp14:editId="74B17BCC">
-                  <wp:extent cx="3778250" cy="2635250"/>
-                  <wp:effectExtent l="0" t="0" r="0" b="0"/>
-                  <wp:docPr id="614057884" name="Picture 1"/>
-                  <wp:cNvGraphicFramePr>
-                    <a:graphicFrameLocks xmlns:a="http://schemas.openxmlformats.org/drawingml/2006/main" noChangeAspect="1"/>
-                  </wp:cNvGraphicFramePr>
-                  <a:graphic xmlns:a="http://schemas.openxmlformats.org/drawingml/2006/main">
-                    <a:graphicData uri="http://schemas.openxmlformats.org/drawingml/2006/picture">
-                      <pic:pic xmlns:pic="http://schemas.openxmlformats.org/drawingml/2006/picture">
-                        <pic:nvPicPr>
-                          <pic:cNvPr id="614057884" name=""/>
-                          <pic:cNvPicPr/>
-                        </pic:nvPicPr>
-                        <pic:blipFill>
-                          <a:blip r:embed="rId21"/>
-                          <a:stretch>
-                            <a:fillRect/>
-                          </a:stretch>
-                        </pic:blipFill>
-                        <pic:spPr>
-                          <a:xfrm>
-                            <a:off x="0" y="0"/>
-                            <a:ext cx="3778250" cy="2635250"/>
-                          </a:xfrm>
-                          <a:prstGeom prst="rect">
-                            <a:avLst/>
-                          </a:prstGeom>
-                        </pic:spPr>
-                      </pic:pic>
-                    </a:graphicData>
-                  </a:graphic>
-                </wp:inline>
-              </w:drawing>
-            </w:r>
-          </w:p>
-        </w:tc>
-      </w:tr>
-      <w:tr>
-        <w:trPr>
-          <w:trHeight w:val="2057"/>
-        </w:trPr>
-        <w:tc>
-          <w:tcPr>
-            <w:tcW w:w="1170" w:type="dxa"/>
-            <w:vAlign w:val="center"/>
-          </w:tcPr>
-          <w:p>
-            <w:pPr>
-              <w:ind w:left="0"/>
-              <w:jc w:val="center"/>
-              <w:rPr>
-                <w:lang w:bidi="ar-EG"/>
-              </w:rPr>
-            </w:pPr>
-            <w:r>
-              <w:rPr>
-                <w:lang w:bidi="ar-EG"/>
-              </w:rPr>
-              <w:t>6</w:t>
-            </w:r>
-          </w:p>
-        </w:tc>
-        <w:tc>
-          <w:tcPr>
-            <w:tcW w:w="2739" w:type="dxa"/>
-            <w:vAlign w:val="center"/>
-          </w:tcPr>
-          <w:p>
-            <w:pPr>
-              <w:ind w:left="0"/>
-              <w:jc w:val="center"/>
-              <w:rPr>
-                <w:lang w:bidi="ar-EG"/>
-              </w:rPr>
-            </w:pPr>
-            <w:r>
-              <w:rPr>
-                <w:noProof/>
-                <w:lang w:bidi="ar-EG"/>
-              </w:rPr>
-              <w:drawing>
-                <wp:inline distT="0" distB="0" distL="0" distR="0" wp14:anchorId="7E8049B5" wp14:editId="1A98900E">
-                  <wp:extent cx="1602105" cy="704850"/>
-                  <wp:effectExtent l="0" t="0" r="0" b="0"/>
-                  <wp:docPr id="136110951" name="Picture 1"/>
-                  <wp:cNvGraphicFramePr>
-                    <a:graphicFrameLocks xmlns:a="http://schemas.openxmlformats.org/drawingml/2006/main" noChangeAspect="1"/>
-                  </wp:cNvGraphicFramePr>
-                  <a:graphic xmlns:a="http://schemas.openxmlformats.org/drawingml/2006/main">
-                    <a:graphicData uri="http://schemas.openxmlformats.org/drawingml/2006/picture">
-                      <pic:pic xmlns:pic="http://schemas.openxmlformats.org/drawingml/2006/picture">
-                        <pic:nvPicPr>
-                          <pic:cNvPr id="136110951" name=""/>
-                          <pic:cNvPicPr/>
-                        </pic:nvPicPr>
-                        <pic:blipFill>
-                          <a:blip r:embed="rId22"/>
-                          <a:stretch>
-                            <a:fillRect/>
-                          </a:stretch>
-                        </pic:blipFill>
-                        <pic:spPr>
-                          <a:xfrm>
-                            <a:off x="0" y="0"/>
-                            <a:ext cx="1602105" cy="704850"/>
-                          </a:xfrm>
-                          <a:prstGeom prst="rect">
-                            <a:avLst/>
-                          </a:prstGeom>
-                        </pic:spPr>
-                      </pic:pic>
-                    </a:graphicData>
-                  </a:graphic>
-                </wp:inline>
-              </w:drawing>
-            </w:r>
-          </w:p>
-        </w:tc>
-        <w:tc>
-          <w:tcPr>
-            <w:tcW w:w="6166" w:type="dxa"/>
-            <w:vAlign w:val="center"/>
-          </w:tcPr>
-          <w:p>
-            <w:pPr>
-              <w:ind w:left="0"/>
-              <w:jc w:val="center"/>
-              <w:rPr>
-                <w:lang w:bidi="ar-EG"/>
-              </w:rPr>
-            </w:pPr>
-            <w:r>
-              <w:rPr>
-                <w:noProof/>
-                <w:lang w:bidi="ar-EG"/>
-              </w:rPr>
-              <w:drawing>
-                <wp:inline distT="0" distB="0" distL="0" distR="0" wp14:anchorId="30DE587E" wp14:editId="0D19C9D8">
-                  <wp:extent cx="3778250" cy="2444750"/>
-                  <wp:effectExtent l="0" t="0" r="0" b="0"/>
-                  <wp:docPr id="726680618" name="Picture 1"/>
-                  <wp:cNvGraphicFramePr>
-                    <a:graphicFrameLocks xmlns:a="http://schemas.openxmlformats.org/drawingml/2006/main" noChangeAspect="1"/>
-                  </wp:cNvGraphicFramePr>
-                  <a:graphic xmlns:a="http://schemas.openxmlformats.org/drawingml/2006/main">
-                    <a:graphicData uri="http://schemas.openxmlformats.org/drawingml/2006/picture">
-                      <pic:pic xmlns:pic="http://schemas.openxmlformats.org/drawingml/2006/picture">
-                        <pic:nvPicPr>
-                          <pic:cNvPr id="726680618" name=""/>
-                          <pic:cNvPicPr/>
-                        </pic:nvPicPr>
-                        <pic:blipFill>
-                          <a:blip r:embed="rId23"/>
-                          <a:stretch>
-                            <a:fillRect/>
-                          </a:stretch>
-                        </pic:blipFill>
-                        <pic:spPr>
-                          <a:xfrm>
-                            <a:off x="0" y="0"/>
-                            <a:ext cx="3778250" cy="2444750"/>
-                          </a:xfrm>
-                          <a:prstGeom prst="rect">
-                            <a:avLst/>
-                          </a:prstGeom>
-                        </pic:spPr>
-                      </pic:pic>
-                    </a:graphicData>
-                  </a:graphic>
-                </wp:inline>
-              </w:drawing>
-            </w:r>
-          </w:p>
-        </w:tc>
-      </w:tr>
-    </w:tbl>
-    <w:p>
-      <w:pPr>
-        <w:rPr>
-          <w:lang w:bidi="ar-EG"/>
-        </w:rPr>
-      </w:pPr>
-    </w:p>
-    <w:p>
-      <w:pPr>
-        <w:rPr>
-          <w:lang w:bidi="ar-EG"/>
-        </w:rPr>
-      </w:pPr>
-    </w:p>
-    <w:p>
-      <w:pPr>
-        <w:ind w:left="0"/>
-        <w:rPr>
-          <w:lang w:bidi="ar-EG"/>
-        </w:rPr>
-      </w:pPr>
-    </w:p>
-    <w:p>
-      <w:pPr>
-        <w:ind w:left="0"/>
-        <w:rPr>
-          <w:lang w:bidi="ar-EG"/>
-        </w:rPr>
-      </w:pPr>
-    </w:p>
-    <w:p>
-      <w:pPr>
-        <w:rPr>
-          <w:lang w:bidi="ar-EG"/>
-        </w:rPr>
-      </w:pPr>
-    </w:p>
-    <w:p>
-      <w:pPr>
-        <w:pStyle w:val="Heading2"/>
-      </w:pPr>
-      <w:bookmarkStart w:id="14" w:name="_Toc226693041"/>
-      <w:r>
-        <w:lastRenderedPageBreak/>
-        <w:t>Answers to Task Questions’</w:t>
-      </w:r>
-      <w:bookmarkEnd w:id="14"/>
     </w:p>
     <w:p>
       <w:r>
@@ -9741,7 +8840,6 @@
       </w:pPr>
       <w:r>
         <w:rPr>
-          <w:rFonts w:eastAsiaTheme="minorEastAsia"/>
           <w:lang w:bidi="ar-EG"/>
         </w:rPr>
         <w:br w:type="page"/>
@@ -9751,13 +8849,1021 @@
       <w:pPr>
         <w:pStyle w:val="Heading2"/>
       </w:pPr>
+      <w:bookmarkStart w:id="14" w:name="_Toc226693040"/>
+      <w:r>
+        <w:lastRenderedPageBreak/>
+        <w:t>2.</w:t>
+      </w:r>
+      <w:r>
+        <w:t>8</w:t>
+      </w:r>
+      <w:r>
+        <w:t xml:space="preserve"> </w:t>
+      </w:r>
+      <w:r>
+        <w:t>Sample outputs</w:t>
+      </w:r>
+      <w:bookmarkEnd w:id="14"/>
+    </w:p>
+    <w:tbl>
+      <w:tblPr>
+        <w:tblStyle w:val="TableGrid"/>
+        <w:tblW w:w="0" w:type="auto"/>
+        <w:tblInd w:w="445" w:type="dxa"/>
+        <w:tblLayout w:type="fixed"/>
+        <w:tblLook w:val="04A0" w:firstRow="1" w:lastRow="0" w:firstColumn="1" w:lastColumn="0" w:noHBand="0" w:noVBand="1"/>
+      </w:tblPr>
+      <w:tblGrid>
+        <w:gridCol w:w="1170"/>
+        <w:gridCol w:w="2739"/>
+        <w:gridCol w:w="6166"/>
+      </w:tblGrid>
+      <w:tr>
+        <w:trPr>
+          <w:trHeight w:val="747"/>
+        </w:trPr>
+        <w:tc>
+          <w:tcPr>
+            <w:tcW w:w="1170" w:type="dxa"/>
+            <w:shd w:val="clear" w:color="auto" w:fill="BFBFBF" w:themeFill="background1" w:themeFillShade="BF"/>
+            <w:vAlign w:val="center"/>
+          </w:tcPr>
+          <w:p>
+            <w:pPr>
+              <w:ind w:left="0"/>
+              <w:jc w:val="center"/>
+              <w:rPr>
+                <w:lang w:bidi="ar-EG"/>
+              </w:rPr>
+            </w:pPr>
+            <w:r>
+              <w:rPr>
+                <w:lang w:bidi="ar-EG"/>
+              </w:rPr>
+              <w:t>Test Case</w:t>
+            </w:r>
+          </w:p>
+        </w:tc>
+        <w:tc>
+          <w:tcPr>
+            <w:tcW w:w="2739" w:type="dxa"/>
+            <w:shd w:val="clear" w:color="auto" w:fill="BFBFBF" w:themeFill="background1" w:themeFillShade="BF"/>
+            <w:vAlign w:val="center"/>
+          </w:tcPr>
+          <w:p>
+            <w:pPr>
+              <w:ind w:left="0"/>
+              <w:jc w:val="center"/>
+              <w:rPr>
+                <w:lang w:bidi="ar-EG"/>
+              </w:rPr>
+            </w:pPr>
+            <w:r>
+              <w:rPr>
+                <w:lang w:bidi="ar-EG"/>
+              </w:rPr>
+              <w:t>Sample Output</w:t>
+            </w:r>
+          </w:p>
+        </w:tc>
+        <w:tc>
+          <w:tcPr>
+            <w:tcW w:w="6166" w:type="dxa"/>
+            <w:shd w:val="clear" w:color="auto" w:fill="BFBFBF" w:themeFill="background1" w:themeFillShade="BF"/>
+            <w:vAlign w:val="center"/>
+          </w:tcPr>
+          <w:p>
+            <w:pPr>
+              <w:ind w:left="0"/>
+              <w:jc w:val="center"/>
+              <w:rPr>
+                <w:lang w:bidi="ar-EG"/>
+              </w:rPr>
+            </w:pPr>
+            <w:r>
+              <w:rPr>
+                <w:lang w:bidi="ar-EG"/>
+              </w:rPr>
+              <w:t>Visualizing (AI generated)</w:t>
+            </w:r>
+          </w:p>
+        </w:tc>
+      </w:tr>
+      <w:tr>
+        <w:trPr>
+          <w:trHeight w:val="2057"/>
+        </w:trPr>
+        <w:tc>
+          <w:tcPr>
+            <w:tcW w:w="1170" w:type="dxa"/>
+            <w:vAlign w:val="center"/>
+          </w:tcPr>
+          <w:p>
+            <w:pPr>
+              <w:ind w:left="0"/>
+              <w:jc w:val="center"/>
+              <w:rPr>
+                <w:lang w:bidi="ar-EG"/>
+              </w:rPr>
+            </w:pPr>
+            <w:r>
+              <w:rPr>
+                <w:lang w:bidi="ar-EG"/>
+              </w:rPr>
+              <w:t>1</w:t>
+            </w:r>
+          </w:p>
+        </w:tc>
+        <w:tc>
+          <w:tcPr>
+            <w:tcW w:w="2739" w:type="dxa"/>
+            <w:vAlign w:val="center"/>
+          </w:tcPr>
+          <w:p>
+            <w:pPr>
+              <w:ind w:left="0"/>
+              <w:jc w:val="center"/>
+              <w:rPr>
+                <w:lang w:bidi="ar-EG"/>
+              </w:rPr>
+            </w:pPr>
+            <w:r>
+              <w:rPr>
+                <w:noProof/>
+                <w:lang w:bidi="ar-EG"/>
+              </w:rPr>
+              <w:drawing>
+                <wp:anchor distT="0" distB="0" distL="114300" distR="114300" simplePos="0" relativeHeight="251660288" behindDoc="1" locked="0" layoutInCell="1" allowOverlap="1" wp14:anchorId="1C42DB01" wp14:editId="065AA696">
+                  <wp:simplePos x="0" y="0"/>
+                  <wp:positionH relativeFrom="column">
+                    <wp:posOffset>-12065</wp:posOffset>
+                  </wp:positionH>
+                  <wp:positionV relativeFrom="paragraph">
+                    <wp:posOffset>-1114425</wp:posOffset>
+                  </wp:positionV>
+                  <wp:extent cx="1696720" cy="1143000"/>
+                  <wp:effectExtent l="0" t="0" r="0" b="0"/>
+                  <wp:wrapTight wrapText="bothSides">
+                    <wp:wrapPolygon edited="0">
+                      <wp:start x="0" y="0"/>
+                      <wp:lineTo x="0" y="21240"/>
+                      <wp:lineTo x="21341" y="21240"/>
+                      <wp:lineTo x="21341" y="0"/>
+                      <wp:lineTo x="0" y="0"/>
+                    </wp:wrapPolygon>
+                  </wp:wrapTight>
+                  <wp:docPr id="342737330" name="Picture 1"/>
+                  <wp:cNvGraphicFramePr>
+                    <a:graphicFrameLocks xmlns:a="http://schemas.openxmlformats.org/drawingml/2006/main" noChangeAspect="1"/>
+                  </wp:cNvGraphicFramePr>
+                  <a:graphic xmlns:a="http://schemas.openxmlformats.org/drawingml/2006/main">
+                    <a:graphicData uri="http://schemas.openxmlformats.org/drawingml/2006/picture">
+                      <pic:pic xmlns:pic="http://schemas.openxmlformats.org/drawingml/2006/picture">
+                        <pic:nvPicPr>
+                          <pic:cNvPr id="342737330" name=""/>
+                          <pic:cNvPicPr/>
+                        </pic:nvPicPr>
+                        <pic:blipFill>
+                          <a:blip r:embed="rId12">
+                            <a:extLst>
+                              <a:ext uri="{28A0092B-C50C-407E-A947-70E740481C1C}">
+                                <a14:useLocalDpi xmlns:a14="http://schemas.microsoft.com/office/drawing/2010/main" val="0"/>
+                              </a:ext>
+                            </a:extLst>
+                          </a:blip>
+                          <a:stretch>
+                            <a:fillRect/>
+                          </a:stretch>
+                        </pic:blipFill>
+                        <pic:spPr>
+                          <a:xfrm>
+                            <a:off x="0" y="0"/>
+                            <a:ext cx="1696720" cy="1143000"/>
+                          </a:xfrm>
+                          <a:prstGeom prst="rect">
+                            <a:avLst/>
+                          </a:prstGeom>
+                        </pic:spPr>
+                      </pic:pic>
+                    </a:graphicData>
+                  </a:graphic>
+                  <wp14:sizeRelH relativeFrom="margin">
+                    <wp14:pctWidth>0</wp14:pctWidth>
+                  </wp14:sizeRelH>
+                  <wp14:sizeRelV relativeFrom="margin">
+                    <wp14:pctHeight>0</wp14:pctHeight>
+                  </wp14:sizeRelV>
+                </wp:anchor>
+              </w:drawing>
+            </w:r>
+          </w:p>
+        </w:tc>
+        <w:tc>
+          <w:tcPr>
+            <w:tcW w:w="6166" w:type="dxa"/>
+            <w:vAlign w:val="center"/>
+          </w:tcPr>
+          <w:p>
+            <w:pPr>
+              <w:ind w:left="0"/>
+              <w:jc w:val="center"/>
+              <w:rPr>
+                <w:lang w:bidi="ar-EG"/>
+              </w:rPr>
+            </w:pPr>
+            <w:r>
+              <w:rPr>
+                <w:noProof/>
+                <w:lang w:bidi="ar-EG"/>
+              </w:rPr>
+              <w:drawing>
+                <wp:inline distT="0" distB="0" distL="0" distR="0" wp14:anchorId="7A024738" wp14:editId="3C9ECAF8">
+                  <wp:extent cx="3810000" cy="2159000"/>
+                  <wp:effectExtent l="0" t="0" r="0" b="0"/>
+                  <wp:docPr id="1271415717" name="Picture 1"/>
+                  <wp:cNvGraphicFramePr>
+                    <a:graphicFrameLocks xmlns:a="http://schemas.openxmlformats.org/drawingml/2006/main" noChangeAspect="1"/>
+                  </wp:cNvGraphicFramePr>
+                  <a:graphic xmlns:a="http://schemas.openxmlformats.org/drawingml/2006/main">
+                    <a:graphicData uri="http://schemas.openxmlformats.org/drawingml/2006/picture">
+                      <pic:pic xmlns:pic="http://schemas.openxmlformats.org/drawingml/2006/picture">
+                        <pic:nvPicPr>
+                          <pic:cNvPr id="1271415717" name=""/>
+                          <pic:cNvPicPr/>
+                        </pic:nvPicPr>
+                        <pic:blipFill>
+                          <a:blip r:embed="rId13"/>
+                          <a:stretch>
+                            <a:fillRect/>
+                          </a:stretch>
+                        </pic:blipFill>
+                        <pic:spPr>
+                          <a:xfrm>
+                            <a:off x="0" y="0"/>
+                            <a:ext cx="3810000" cy="2159000"/>
+                          </a:xfrm>
+                          <a:prstGeom prst="rect">
+                            <a:avLst/>
+                          </a:prstGeom>
+                        </pic:spPr>
+                      </pic:pic>
+                    </a:graphicData>
+                  </a:graphic>
+                </wp:inline>
+              </w:drawing>
+            </w:r>
+          </w:p>
+        </w:tc>
+      </w:tr>
+      <w:tr>
+        <w:trPr>
+          <w:trHeight w:val="1979"/>
+        </w:trPr>
+        <w:tc>
+          <w:tcPr>
+            <w:tcW w:w="1170" w:type="dxa"/>
+            <w:vAlign w:val="center"/>
+          </w:tcPr>
+          <w:p>
+            <w:pPr>
+              <w:ind w:left="0"/>
+              <w:jc w:val="center"/>
+              <w:rPr>
+                <w:lang w:bidi="ar-EG"/>
+              </w:rPr>
+            </w:pPr>
+            <w:r>
+              <w:rPr>
+                <w:lang w:bidi="ar-EG"/>
+              </w:rPr>
+              <w:t>2</w:t>
+            </w:r>
+          </w:p>
+        </w:tc>
+        <w:tc>
+          <w:tcPr>
+            <w:tcW w:w="2739" w:type="dxa"/>
+            <w:vAlign w:val="center"/>
+          </w:tcPr>
+          <w:p>
+            <w:pPr>
+              <w:ind w:left="0"/>
+              <w:jc w:val="center"/>
+              <w:rPr>
+                <w:lang w:bidi="ar-EG"/>
+              </w:rPr>
+            </w:pPr>
+            <w:r>
+              <w:rPr>
+                <w:noProof/>
+                <w:lang w:bidi="ar-EG"/>
+              </w:rPr>
+              <w:drawing>
+                <wp:inline distT="0" distB="0" distL="0" distR="0" wp14:anchorId="561CF1C3" wp14:editId="2F73B748">
+                  <wp:extent cx="2072820" cy="853514"/>
+                  <wp:effectExtent l="0" t="0" r="3810" b="3810"/>
+                  <wp:docPr id="742541119" name="Picture 1"/>
+                  <wp:cNvGraphicFramePr>
+                    <a:graphicFrameLocks xmlns:a="http://schemas.openxmlformats.org/drawingml/2006/main" noChangeAspect="1"/>
+                  </wp:cNvGraphicFramePr>
+                  <a:graphic xmlns:a="http://schemas.openxmlformats.org/drawingml/2006/main">
+                    <a:graphicData uri="http://schemas.openxmlformats.org/drawingml/2006/picture">
+                      <pic:pic xmlns:pic="http://schemas.openxmlformats.org/drawingml/2006/picture">
+                        <pic:nvPicPr>
+                          <pic:cNvPr id="742541119" name=""/>
+                          <pic:cNvPicPr/>
+                        </pic:nvPicPr>
+                        <pic:blipFill>
+                          <a:blip r:embed="rId14"/>
+                          <a:stretch>
+                            <a:fillRect/>
+                          </a:stretch>
+                        </pic:blipFill>
+                        <pic:spPr>
+                          <a:xfrm>
+                            <a:off x="0" y="0"/>
+                            <a:ext cx="2072820" cy="853514"/>
+                          </a:xfrm>
+                          <a:prstGeom prst="rect">
+                            <a:avLst/>
+                          </a:prstGeom>
+                        </pic:spPr>
+                      </pic:pic>
+                    </a:graphicData>
+                  </a:graphic>
+                </wp:inline>
+              </w:drawing>
+            </w:r>
+          </w:p>
+        </w:tc>
+        <w:tc>
+          <w:tcPr>
+            <w:tcW w:w="6166" w:type="dxa"/>
+            <w:vAlign w:val="center"/>
+          </w:tcPr>
+          <w:p>
+            <w:pPr>
+              <w:ind w:left="0"/>
+              <w:jc w:val="center"/>
+              <w:rPr>
+                <w:lang w:bidi="ar-EG"/>
+              </w:rPr>
+            </w:pPr>
+            <w:r>
+              <w:rPr>
+                <w:noProof/>
+                <w:lang w:bidi="ar-EG"/>
+              </w:rPr>
+              <w:drawing>
+                <wp:inline distT="0" distB="0" distL="0" distR="0" wp14:anchorId="5F29E1A5" wp14:editId="63F7BC62">
+                  <wp:extent cx="3810000" cy="2527300"/>
+                  <wp:effectExtent l="0" t="0" r="0" b="6350"/>
+                  <wp:docPr id="883427239" name="Picture 1"/>
+                  <wp:cNvGraphicFramePr>
+                    <a:graphicFrameLocks xmlns:a="http://schemas.openxmlformats.org/drawingml/2006/main" noChangeAspect="1"/>
+                  </wp:cNvGraphicFramePr>
+                  <a:graphic xmlns:a="http://schemas.openxmlformats.org/drawingml/2006/main">
+                    <a:graphicData uri="http://schemas.openxmlformats.org/drawingml/2006/picture">
+                      <pic:pic xmlns:pic="http://schemas.openxmlformats.org/drawingml/2006/picture">
+                        <pic:nvPicPr>
+                          <pic:cNvPr id="883427239" name=""/>
+                          <pic:cNvPicPr/>
+                        </pic:nvPicPr>
+                        <pic:blipFill>
+                          <a:blip r:embed="rId15"/>
+                          <a:stretch>
+                            <a:fillRect/>
+                          </a:stretch>
+                        </pic:blipFill>
+                        <pic:spPr>
+                          <a:xfrm>
+                            <a:off x="0" y="0"/>
+                            <a:ext cx="3810000" cy="2527300"/>
+                          </a:xfrm>
+                          <a:prstGeom prst="rect">
+                            <a:avLst/>
+                          </a:prstGeom>
+                        </pic:spPr>
+                      </pic:pic>
+                    </a:graphicData>
+                  </a:graphic>
+                </wp:inline>
+              </w:drawing>
+            </w:r>
+          </w:p>
+        </w:tc>
+      </w:tr>
+      <w:tr>
+        <w:trPr>
+          <w:trHeight w:val="2057"/>
+        </w:trPr>
+        <w:tc>
+          <w:tcPr>
+            <w:tcW w:w="1170" w:type="dxa"/>
+            <w:vAlign w:val="center"/>
+          </w:tcPr>
+          <w:p>
+            <w:pPr>
+              <w:ind w:left="0"/>
+              <w:jc w:val="center"/>
+              <w:rPr>
+                <w:lang w:bidi="ar-EG"/>
+              </w:rPr>
+            </w:pPr>
+            <w:r>
+              <w:rPr>
+                <w:lang w:bidi="ar-EG"/>
+              </w:rPr>
+              <w:t>3</w:t>
+            </w:r>
+          </w:p>
+        </w:tc>
+        <w:tc>
+          <w:tcPr>
+            <w:tcW w:w="2739" w:type="dxa"/>
+            <w:vAlign w:val="center"/>
+          </w:tcPr>
+          <w:p>
+            <w:pPr>
+              <w:ind w:left="0"/>
+              <w:jc w:val="center"/>
+              <w:rPr>
+                <w:lang w:bidi="ar-EG"/>
+              </w:rPr>
+            </w:pPr>
+            <w:r>
+              <w:rPr>
+                <w:noProof/>
+                <w:lang w:bidi="ar-EG"/>
+              </w:rPr>
+              <w:drawing>
+                <wp:inline distT="0" distB="0" distL="0" distR="0" wp14:anchorId="18BD578A" wp14:editId="32D40C92">
+                  <wp:extent cx="1716405" cy="686435"/>
+                  <wp:effectExtent l="0" t="0" r="0" b="0"/>
+                  <wp:docPr id="866643971" name="Picture 1"/>
+                  <wp:cNvGraphicFramePr>
+                    <a:graphicFrameLocks xmlns:a="http://schemas.openxmlformats.org/drawingml/2006/main" noChangeAspect="1"/>
+                  </wp:cNvGraphicFramePr>
+                  <a:graphic xmlns:a="http://schemas.openxmlformats.org/drawingml/2006/main">
+                    <a:graphicData uri="http://schemas.openxmlformats.org/drawingml/2006/picture">
+                      <pic:pic xmlns:pic="http://schemas.openxmlformats.org/drawingml/2006/picture">
+                        <pic:nvPicPr>
+                          <pic:cNvPr id="866643971" name=""/>
+                          <pic:cNvPicPr/>
+                        </pic:nvPicPr>
+                        <pic:blipFill>
+                          <a:blip r:embed="rId16"/>
+                          <a:stretch>
+                            <a:fillRect/>
+                          </a:stretch>
+                        </pic:blipFill>
+                        <pic:spPr>
+                          <a:xfrm>
+                            <a:off x="0" y="0"/>
+                            <a:ext cx="1716405" cy="686435"/>
+                          </a:xfrm>
+                          <a:prstGeom prst="rect">
+                            <a:avLst/>
+                          </a:prstGeom>
+                        </pic:spPr>
+                      </pic:pic>
+                    </a:graphicData>
+                  </a:graphic>
+                </wp:inline>
+              </w:drawing>
+            </w:r>
+          </w:p>
+        </w:tc>
+        <w:tc>
+          <w:tcPr>
+            <w:tcW w:w="6166" w:type="dxa"/>
+            <w:vAlign w:val="center"/>
+          </w:tcPr>
+          <w:p>
+            <w:pPr>
+              <w:ind w:left="0"/>
+              <w:jc w:val="center"/>
+              <w:rPr>
+                <w:lang w:bidi="ar-EG"/>
+              </w:rPr>
+            </w:pPr>
+            <w:r>
+              <w:rPr>
+                <w:noProof/>
+                <w:lang w:bidi="ar-EG"/>
+              </w:rPr>
+              <w:drawing>
+                <wp:inline distT="0" distB="0" distL="0" distR="0" wp14:anchorId="2E4E6625" wp14:editId="7AE1C4FA">
+                  <wp:extent cx="3778250" cy="2305050"/>
+                  <wp:effectExtent l="0" t="0" r="0" b="0"/>
+                  <wp:docPr id="2002354459" name="Picture 1"/>
+                  <wp:cNvGraphicFramePr>
+                    <a:graphicFrameLocks xmlns:a="http://schemas.openxmlformats.org/drawingml/2006/main" noChangeAspect="1"/>
+                  </wp:cNvGraphicFramePr>
+                  <a:graphic xmlns:a="http://schemas.openxmlformats.org/drawingml/2006/main">
+                    <a:graphicData uri="http://schemas.openxmlformats.org/drawingml/2006/picture">
+                      <pic:pic xmlns:pic="http://schemas.openxmlformats.org/drawingml/2006/picture">
+                        <pic:nvPicPr>
+                          <pic:cNvPr id="2002354459" name=""/>
+                          <pic:cNvPicPr/>
+                        </pic:nvPicPr>
+                        <pic:blipFill>
+                          <a:blip r:embed="rId17"/>
+                          <a:stretch>
+                            <a:fillRect/>
+                          </a:stretch>
+                        </pic:blipFill>
+                        <pic:spPr>
+                          <a:xfrm>
+                            <a:off x="0" y="0"/>
+                            <a:ext cx="3778250" cy="2305050"/>
+                          </a:xfrm>
+                          <a:prstGeom prst="rect">
+                            <a:avLst/>
+                          </a:prstGeom>
+                        </pic:spPr>
+                      </pic:pic>
+                    </a:graphicData>
+                  </a:graphic>
+                </wp:inline>
+              </w:drawing>
+            </w:r>
+          </w:p>
+        </w:tc>
+      </w:tr>
+      <w:tr>
+        <w:trPr>
+          <w:trHeight w:val="2057"/>
+        </w:trPr>
+        <w:tc>
+          <w:tcPr>
+            <w:tcW w:w="1170" w:type="dxa"/>
+            <w:vAlign w:val="center"/>
+          </w:tcPr>
+          <w:p>
+            <w:pPr>
+              <w:ind w:left="0"/>
+              <w:jc w:val="center"/>
+              <w:rPr>
+                <w:lang w:bidi="ar-EG"/>
+              </w:rPr>
+            </w:pPr>
+            <w:r>
+              <w:rPr>
+                <w:lang w:bidi="ar-EG"/>
+              </w:rPr>
+              <w:lastRenderedPageBreak/>
+              <w:t>4</w:t>
+            </w:r>
+          </w:p>
+        </w:tc>
+        <w:tc>
+          <w:tcPr>
+            <w:tcW w:w="2739" w:type="dxa"/>
+            <w:vAlign w:val="center"/>
+          </w:tcPr>
+          <w:p>
+            <w:pPr>
+              <w:ind w:left="0"/>
+              <w:jc w:val="center"/>
+              <w:rPr>
+                <w:lang w:bidi="ar-EG"/>
+              </w:rPr>
+            </w:pPr>
+            <w:r>
+              <w:rPr>
+                <w:noProof/>
+                <w:lang w:bidi="ar-EG"/>
+              </w:rPr>
+              <w:drawing>
+                <wp:inline distT="0" distB="0" distL="0" distR="0" wp14:anchorId="5EEDB4F7" wp14:editId="60444FA8">
+                  <wp:extent cx="1716405" cy="701040"/>
+                  <wp:effectExtent l="0" t="0" r="0" b="3810"/>
+                  <wp:docPr id="567261073" name="Picture 1"/>
+                  <wp:cNvGraphicFramePr>
+                    <a:graphicFrameLocks xmlns:a="http://schemas.openxmlformats.org/drawingml/2006/main" noChangeAspect="1"/>
+                  </wp:cNvGraphicFramePr>
+                  <a:graphic xmlns:a="http://schemas.openxmlformats.org/drawingml/2006/main">
+                    <a:graphicData uri="http://schemas.openxmlformats.org/drawingml/2006/picture">
+                      <pic:pic xmlns:pic="http://schemas.openxmlformats.org/drawingml/2006/picture">
+                        <pic:nvPicPr>
+                          <pic:cNvPr id="567261073" name=""/>
+                          <pic:cNvPicPr/>
+                        </pic:nvPicPr>
+                        <pic:blipFill>
+                          <a:blip r:embed="rId18"/>
+                          <a:stretch>
+                            <a:fillRect/>
+                          </a:stretch>
+                        </pic:blipFill>
+                        <pic:spPr>
+                          <a:xfrm>
+                            <a:off x="0" y="0"/>
+                            <a:ext cx="1716405" cy="701040"/>
+                          </a:xfrm>
+                          <a:prstGeom prst="rect">
+                            <a:avLst/>
+                          </a:prstGeom>
+                        </pic:spPr>
+                      </pic:pic>
+                    </a:graphicData>
+                  </a:graphic>
+                </wp:inline>
+              </w:drawing>
+            </w:r>
+          </w:p>
+        </w:tc>
+        <w:tc>
+          <w:tcPr>
+            <w:tcW w:w="6166" w:type="dxa"/>
+            <w:vAlign w:val="center"/>
+          </w:tcPr>
+          <w:p>
+            <w:pPr>
+              <w:ind w:left="0"/>
+              <w:jc w:val="center"/>
+              <w:rPr>
+                <w:lang w:bidi="ar-EG"/>
+              </w:rPr>
+            </w:pPr>
+            <w:r>
+              <w:rPr>
+                <w:noProof/>
+                <w:lang w:bidi="ar-EG"/>
+              </w:rPr>
+              <w:drawing>
+                <wp:inline distT="0" distB="0" distL="0" distR="0" wp14:anchorId="1357E080" wp14:editId="3D469C24">
+                  <wp:extent cx="3778250" cy="2743200"/>
+                  <wp:effectExtent l="0" t="0" r="0" b="0"/>
+                  <wp:docPr id="59180424" name="Picture 1"/>
+                  <wp:cNvGraphicFramePr>
+                    <a:graphicFrameLocks xmlns:a="http://schemas.openxmlformats.org/drawingml/2006/main" noChangeAspect="1"/>
+                  </wp:cNvGraphicFramePr>
+                  <a:graphic xmlns:a="http://schemas.openxmlformats.org/drawingml/2006/main">
+                    <a:graphicData uri="http://schemas.openxmlformats.org/drawingml/2006/picture">
+                      <pic:pic xmlns:pic="http://schemas.openxmlformats.org/drawingml/2006/picture">
+                        <pic:nvPicPr>
+                          <pic:cNvPr id="59180424" name=""/>
+                          <pic:cNvPicPr/>
+                        </pic:nvPicPr>
+                        <pic:blipFill>
+                          <a:blip r:embed="rId19"/>
+                          <a:stretch>
+                            <a:fillRect/>
+                          </a:stretch>
+                        </pic:blipFill>
+                        <pic:spPr>
+                          <a:xfrm>
+                            <a:off x="0" y="0"/>
+                            <a:ext cx="3778250" cy="2743200"/>
+                          </a:xfrm>
+                          <a:prstGeom prst="rect">
+                            <a:avLst/>
+                          </a:prstGeom>
+                        </pic:spPr>
+                      </pic:pic>
+                    </a:graphicData>
+                  </a:graphic>
+                </wp:inline>
+              </w:drawing>
+            </w:r>
+          </w:p>
+        </w:tc>
+      </w:tr>
+      <w:tr>
+        <w:trPr>
+          <w:trHeight w:val="2057"/>
+        </w:trPr>
+        <w:tc>
+          <w:tcPr>
+            <w:tcW w:w="1170" w:type="dxa"/>
+            <w:vAlign w:val="center"/>
+          </w:tcPr>
+          <w:p>
+            <w:pPr>
+              <w:ind w:left="0"/>
+              <w:jc w:val="center"/>
+              <w:rPr>
+                <w:lang w:bidi="ar-EG"/>
+              </w:rPr>
+            </w:pPr>
+            <w:r>
+              <w:rPr>
+                <w:lang w:bidi="ar-EG"/>
+              </w:rPr>
+              <w:t>5</w:t>
+            </w:r>
+          </w:p>
+        </w:tc>
+        <w:tc>
+          <w:tcPr>
+            <w:tcW w:w="2739" w:type="dxa"/>
+            <w:vAlign w:val="center"/>
+          </w:tcPr>
+          <w:p>
+            <w:pPr>
+              <w:ind w:left="0"/>
+              <w:jc w:val="center"/>
+              <w:rPr>
+                <w:lang w:bidi="ar-EG"/>
+              </w:rPr>
+            </w:pPr>
+            <w:r>
+              <w:rPr>
+                <w:noProof/>
+                <w:lang w:bidi="ar-EG"/>
+              </w:rPr>
+              <w:drawing>
+                <wp:inline distT="0" distB="0" distL="0" distR="0" wp14:anchorId="3C917327" wp14:editId="32FB726A">
+                  <wp:extent cx="1716405" cy="758825"/>
+                  <wp:effectExtent l="0" t="0" r="0" b="3175"/>
+                  <wp:docPr id="1134705241" name="Picture 1"/>
+                  <wp:cNvGraphicFramePr>
+                    <a:graphicFrameLocks xmlns:a="http://schemas.openxmlformats.org/drawingml/2006/main" noChangeAspect="1"/>
+                  </wp:cNvGraphicFramePr>
+                  <a:graphic xmlns:a="http://schemas.openxmlformats.org/drawingml/2006/main">
+                    <a:graphicData uri="http://schemas.openxmlformats.org/drawingml/2006/picture">
+                      <pic:pic xmlns:pic="http://schemas.openxmlformats.org/drawingml/2006/picture">
+                        <pic:nvPicPr>
+                          <pic:cNvPr id="1134705241" name=""/>
+                          <pic:cNvPicPr/>
+                        </pic:nvPicPr>
+                        <pic:blipFill>
+                          <a:blip r:embed="rId20"/>
+                          <a:stretch>
+                            <a:fillRect/>
+                          </a:stretch>
+                        </pic:blipFill>
+                        <pic:spPr>
+                          <a:xfrm>
+                            <a:off x="0" y="0"/>
+                            <a:ext cx="1716405" cy="758825"/>
+                          </a:xfrm>
+                          <a:prstGeom prst="rect">
+                            <a:avLst/>
+                          </a:prstGeom>
+                        </pic:spPr>
+                      </pic:pic>
+                    </a:graphicData>
+                  </a:graphic>
+                </wp:inline>
+              </w:drawing>
+            </w:r>
+          </w:p>
+        </w:tc>
+        <w:tc>
+          <w:tcPr>
+            <w:tcW w:w="6166" w:type="dxa"/>
+            <w:vAlign w:val="center"/>
+          </w:tcPr>
+          <w:p>
+            <w:pPr>
+              <w:ind w:left="0"/>
+              <w:jc w:val="center"/>
+              <w:rPr>
+                <w:lang w:bidi="ar-EG"/>
+              </w:rPr>
+            </w:pPr>
+            <w:r>
+              <w:rPr>
+                <w:noProof/>
+                <w:lang w:bidi="ar-EG"/>
+              </w:rPr>
+              <w:drawing>
+                <wp:inline distT="0" distB="0" distL="0" distR="0" wp14:anchorId="43317B73" wp14:editId="74B17BCC">
+                  <wp:extent cx="3778250" cy="2635250"/>
+                  <wp:effectExtent l="0" t="0" r="0" b="0"/>
+                  <wp:docPr id="614057884" name="Picture 1"/>
+                  <wp:cNvGraphicFramePr>
+                    <a:graphicFrameLocks xmlns:a="http://schemas.openxmlformats.org/drawingml/2006/main" noChangeAspect="1"/>
+                  </wp:cNvGraphicFramePr>
+                  <a:graphic xmlns:a="http://schemas.openxmlformats.org/drawingml/2006/main">
+                    <a:graphicData uri="http://schemas.openxmlformats.org/drawingml/2006/picture">
+                      <pic:pic xmlns:pic="http://schemas.openxmlformats.org/drawingml/2006/picture">
+                        <pic:nvPicPr>
+                          <pic:cNvPr id="614057884" name=""/>
+                          <pic:cNvPicPr/>
+                        </pic:nvPicPr>
+                        <pic:blipFill>
+                          <a:blip r:embed="rId21"/>
+                          <a:stretch>
+                            <a:fillRect/>
+                          </a:stretch>
+                        </pic:blipFill>
+                        <pic:spPr>
+                          <a:xfrm>
+                            <a:off x="0" y="0"/>
+                            <a:ext cx="3778250" cy="2635250"/>
+                          </a:xfrm>
+                          <a:prstGeom prst="rect">
+                            <a:avLst/>
+                          </a:prstGeom>
+                        </pic:spPr>
+                      </pic:pic>
+                    </a:graphicData>
+                  </a:graphic>
+                </wp:inline>
+              </w:drawing>
+            </w:r>
+          </w:p>
+        </w:tc>
+      </w:tr>
+      <w:tr>
+        <w:trPr>
+          <w:trHeight w:val="2057"/>
+        </w:trPr>
+        <w:tc>
+          <w:tcPr>
+            <w:tcW w:w="1170" w:type="dxa"/>
+            <w:vAlign w:val="center"/>
+          </w:tcPr>
+          <w:p>
+            <w:pPr>
+              <w:ind w:left="0"/>
+              <w:jc w:val="center"/>
+              <w:rPr>
+                <w:lang w:bidi="ar-EG"/>
+              </w:rPr>
+            </w:pPr>
+            <w:r>
+              <w:rPr>
+                <w:lang w:bidi="ar-EG"/>
+              </w:rPr>
+              <w:t>6</w:t>
+            </w:r>
+          </w:p>
+        </w:tc>
+        <w:tc>
+          <w:tcPr>
+            <w:tcW w:w="2739" w:type="dxa"/>
+            <w:vAlign w:val="center"/>
+          </w:tcPr>
+          <w:p>
+            <w:pPr>
+              <w:ind w:left="0"/>
+              <w:jc w:val="center"/>
+              <w:rPr>
+                <w:lang w:bidi="ar-EG"/>
+              </w:rPr>
+            </w:pPr>
+            <w:r>
+              <w:rPr>
+                <w:noProof/>
+                <w:lang w:bidi="ar-EG"/>
+              </w:rPr>
+              <w:drawing>
+                <wp:inline distT="0" distB="0" distL="0" distR="0" wp14:anchorId="7E8049B5" wp14:editId="1A98900E">
+                  <wp:extent cx="1602105" cy="704850"/>
+                  <wp:effectExtent l="0" t="0" r="0" b="0"/>
+                  <wp:docPr id="136110951" name="Picture 1"/>
+                  <wp:cNvGraphicFramePr>
+                    <a:graphicFrameLocks xmlns:a="http://schemas.openxmlformats.org/drawingml/2006/main" noChangeAspect="1"/>
+                  </wp:cNvGraphicFramePr>
+                  <a:graphic xmlns:a="http://schemas.openxmlformats.org/drawingml/2006/main">
+                    <a:graphicData uri="http://schemas.openxmlformats.org/drawingml/2006/picture">
+                      <pic:pic xmlns:pic="http://schemas.openxmlformats.org/drawingml/2006/picture">
+                        <pic:nvPicPr>
+                          <pic:cNvPr id="136110951" name=""/>
+                          <pic:cNvPicPr/>
+                        </pic:nvPicPr>
+                        <pic:blipFill>
+                          <a:blip r:embed="rId22"/>
+                          <a:stretch>
+                            <a:fillRect/>
+                          </a:stretch>
+                        </pic:blipFill>
+                        <pic:spPr>
+                          <a:xfrm>
+                            <a:off x="0" y="0"/>
+                            <a:ext cx="1602105" cy="704850"/>
+                          </a:xfrm>
+                          <a:prstGeom prst="rect">
+                            <a:avLst/>
+                          </a:prstGeom>
+                        </pic:spPr>
+                      </pic:pic>
+                    </a:graphicData>
+                  </a:graphic>
+                </wp:inline>
+              </w:drawing>
+            </w:r>
+          </w:p>
+        </w:tc>
+        <w:tc>
+          <w:tcPr>
+            <w:tcW w:w="6166" w:type="dxa"/>
+            <w:vAlign w:val="center"/>
+          </w:tcPr>
+          <w:p>
+            <w:pPr>
+              <w:ind w:left="0"/>
+              <w:jc w:val="center"/>
+              <w:rPr>
+                <w:lang w:bidi="ar-EG"/>
+              </w:rPr>
+            </w:pPr>
+            <w:r>
+              <w:rPr>
+                <w:noProof/>
+                <w:lang w:bidi="ar-EG"/>
+              </w:rPr>
+              <w:drawing>
+                <wp:inline distT="0" distB="0" distL="0" distR="0" wp14:anchorId="30DE587E" wp14:editId="0D19C9D8">
+                  <wp:extent cx="3778250" cy="2444750"/>
+                  <wp:effectExtent l="0" t="0" r="0" b="0"/>
+                  <wp:docPr id="726680618" name="Picture 1"/>
+                  <wp:cNvGraphicFramePr>
+                    <a:graphicFrameLocks xmlns:a="http://schemas.openxmlformats.org/drawingml/2006/main" noChangeAspect="1"/>
+                  </wp:cNvGraphicFramePr>
+                  <a:graphic xmlns:a="http://schemas.openxmlformats.org/drawingml/2006/main">
+                    <a:graphicData uri="http://schemas.openxmlformats.org/drawingml/2006/picture">
+                      <pic:pic xmlns:pic="http://schemas.openxmlformats.org/drawingml/2006/picture">
+                        <pic:nvPicPr>
+                          <pic:cNvPr id="726680618" name=""/>
+                          <pic:cNvPicPr/>
+                        </pic:nvPicPr>
+                        <pic:blipFill>
+                          <a:blip r:embed="rId23"/>
+                          <a:stretch>
+                            <a:fillRect/>
+                          </a:stretch>
+                        </pic:blipFill>
+                        <pic:spPr>
+                          <a:xfrm>
+                            <a:off x="0" y="0"/>
+                            <a:ext cx="3778250" cy="2444750"/>
+                          </a:xfrm>
+                          <a:prstGeom prst="rect">
+                            <a:avLst/>
+                          </a:prstGeom>
+                        </pic:spPr>
+                      </pic:pic>
+                    </a:graphicData>
+                  </a:graphic>
+                </wp:inline>
+              </w:drawing>
+            </w:r>
+          </w:p>
+        </w:tc>
+      </w:tr>
+    </w:tbl>
+    <w:p>
+      <w:pPr>
+        <w:rPr>
+          <w:lang w:bidi="ar-EG"/>
+        </w:rPr>
+      </w:pPr>
+    </w:p>
+    <w:p>
+      <w:pPr>
+        <w:rPr>
+          <w:lang w:bidi="ar-EG"/>
+        </w:rPr>
+      </w:pPr>
+    </w:p>
+    <w:p>
+      <w:pPr>
+        <w:ind w:left="0"/>
+        <w:rPr>
+          <w:lang w:bidi="ar-EG"/>
+        </w:rPr>
+      </w:pPr>
+    </w:p>
+    <w:p>
+      <w:pPr>
+        <w:ind w:left="0"/>
+        <w:rPr>
+          <w:lang w:bidi="ar-EG"/>
+        </w:rPr>
+      </w:pPr>
+    </w:p>
+    <w:p>
+      <w:pPr>
+        <w:rPr>
+          <w:lang w:bidi="ar-EG"/>
+        </w:rPr>
+      </w:pPr>
+    </w:p>
+    <w:p>
+      <w:pPr>
+        <w:pStyle w:val="Heading2"/>
+      </w:pPr>
       <w:bookmarkStart w:id="15" w:name="_Toc226693042"/>
       <w:r>
         <w:lastRenderedPageBreak/>
+        <w:t xml:space="preserve">2.9 </w:t>
+      </w:r>
+      <w:r>
         <w:t>Alternative</w:t>
       </w:r>
       <w:r>
-        <w:t xml:space="preserve"> Solutions</w:t>
+        <w:t xml:space="preserve"> </w:t>
+      </w:r>
+      <w:r>
+        <w:t>s</w:t>
+      </w:r>
+      <w:r>
+        <w:t>olutions</w:t>
       </w:r>
       <w:bookmarkEnd w:id="15"/>
     </w:p>
@@ -9992,6 +10098,9 @@
         <w:pStyle w:val="Heading2"/>
       </w:pPr>
       <w:bookmarkStart w:id="16" w:name="_Toc226693043"/>
+      <w:r>
+        <w:t xml:space="preserve">2.10 </w:t>
+      </w:r>
       <w:r>
         <w:t>Key findings and insights</w:t>
       </w:r>
@@ -21950,7 +22059,7 @@
       <w:lvlText w:val=""/>
       <w:lvlJc w:val="left"/>
       <w:pPr>
-        <w:ind w:left="2160" w:hanging="360"/>
+        <w:ind w:left="1080" w:hanging="360"/>
       </w:pPr>
       <w:rPr>
         <w:rFonts w:ascii="Symbol" w:hAnsi="Symbol" w:hint="default"/>
@@ -21962,7 +22071,7 @@
       <w:lvlText w:val="o"/>
       <w:lvlJc w:val="left"/>
       <w:pPr>
-        <w:ind w:left="2880" w:hanging="360"/>
+        <w:ind w:left="1800" w:hanging="360"/>
       </w:pPr>
       <w:rPr>
         <w:rFonts w:ascii="Courier New" w:hAnsi="Courier New" w:cs="Courier New" w:hint="default"/>
@@ -21974,7 +22083,7 @@
       <w:lvlText w:val=""/>
       <w:lvlJc w:val="left"/>
       <w:pPr>
-        <w:ind w:left="3600" w:hanging="360"/>
+        <w:ind w:left="2520" w:hanging="360"/>
       </w:pPr>
       <w:rPr>
         <w:rFonts w:ascii="Wingdings" w:hAnsi="Wingdings" w:hint="default"/>
@@ -21986,7 +22095,7 @@
       <w:lvlText w:val=""/>
       <w:lvlJc w:val="left"/>
       <w:pPr>
-        <w:ind w:left="4320" w:hanging="360"/>
+        <w:ind w:left="3240" w:hanging="360"/>
       </w:pPr>
       <w:rPr>
         <w:rFonts w:ascii="Symbol" w:hAnsi="Symbol" w:hint="default"/>
@@ -21998,7 +22107,7 @@
       <w:lvlText w:val="o"/>
       <w:lvlJc w:val="left"/>
       <w:pPr>
-        <w:ind w:left="5040" w:hanging="360"/>
+        <w:ind w:left="3960" w:hanging="360"/>
       </w:pPr>
       <w:rPr>
         <w:rFonts w:ascii="Courier New" w:hAnsi="Courier New" w:cs="Courier New" w:hint="default"/>
@@ -22010,7 +22119,7 @@
       <w:lvlText w:val=""/>
       <w:lvlJc w:val="left"/>
       <w:pPr>
-        <w:ind w:left="5760" w:hanging="360"/>
+        <w:ind w:left="4680" w:hanging="360"/>
       </w:pPr>
       <w:rPr>
         <w:rFonts w:ascii="Wingdings" w:hAnsi="Wingdings" w:hint="default"/>
@@ -22022,7 +22131,7 @@
       <w:lvlText w:val=""/>
       <w:lvlJc w:val="left"/>
       <w:pPr>
-        <w:ind w:left="6480" w:hanging="360"/>
+        <w:ind w:left="5400" w:hanging="360"/>
       </w:pPr>
       <w:rPr>
         <w:rFonts w:ascii="Symbol" w:hAnsi="Symbol" w:hint="default"/>
@@ -22034,7 +22143,7 @@
       <w:lvlText w:val="o"/>
       <w:lvlJc w:val="left"/>
       <w:pPr>
-        <w:ind w:left="7200" w:hanging="360"/>
+        <w:ind w:left="6120" w:hanging="360"/>
       </w:pPr>
       <w:rPr>
         <w:rFonts w:ascii="Courier New" w:hAnsi="Courier New" w:cs="Courier New" w:hint="default"/>
@@ -22046,7 +22155,7 @@
       <w:lvlText w:val=""/>
       <w:lvlJc w:val="left"/>
       <w:pPr>
-        <w:ind w:left="7920" w:hanging="360"/>
+        <w:ind w:left="6840" w:hanging="360"/>
       </w:pPr>
       <w:rPr>
         <w:rFonts w:ascii="Wingdings" w:hAnsi="Wingdings" w:hint="default"/>

</xml_diff>